<commit_message>
feat(inbox): auto-size figures to full text width in all three AAN docs
Adds fig-width: 6.5, fig-align: center, out-width: "100%" to YAML frontmatter
of all three Federal_Application_Aware_Networking documents. This makes every
image and diagram stretch to full text margins in both DOCX (Word) and HTML
(browser) without per-figure width attributes. Re-rendered and re-styled DOCXs.

Co-Authored-By: Claude Sonnet 4.6 <noreply@anthropic.com>
</commit_message>
<xml_diff>
--- a/inbox/Federal_Application_Aware_Networking_Federal_Telecommunications_Modernization.docx
+++ b/inbox/Federal_Application_Aware_Networking_Federal_Telecommunications_Modernization.docx
@@ -42,7 +42,7 @@
           <w:sz w:val="24"/>
           <w:szCs w:val="24"/>
         </w:rPr>
-        <w:id w:val="-2048135857"/>
+        <w:id w:val="2094041669"/>
         <w:docPartObj>
           <w:docPartGallery w:val="Table of Contents"/>
           <w:docPartUnique/>
@@ -80,7 +80,7 @@
           <w:r>
             <w:fldChar w:fldCharType="separate"/>
           </w:r>
-          <w:hyperlink w:anchor="_Toc233786863" w:history="1">
+          <w:hyperlink w:anchor="_Toc233815396" w:history="1">
             <w:r>
               <w:rPr>
                 <w:rStyle w:val="Hyperlink"/>
@@ -107,7 +107,7 @@
                 <w:noProof/>
                 <w:webHidden/>
               </w:rPr>
-              <w:instrText xml:space="preserve"> PAGEREF _Toc233786863 \h </w:instrText>
+              <w:instrText xml:space="preserve"> PAGEREF _Toc233815396 \h </w:instrText>
             </w:r>
             <w:r>
               <w:rPr>
@@ -151,7 +151,7 @@
               <w14:ligatures w14:val="standardContextual"/>
             </w:rPr>
           </w:pPr>
-          <w:hyperlink w:anchor="_Toc233786864" w:history="1">
+          <w:hyperlink w:anchor="_Toc233815397" w:history="1">
             <w:r>
               <w:rPr>
                 <w:rStyle w:val="Hyperlink"/>
@@ -178,7 +178,7 @@
                 <w:noProof/>
                 <w:webHidden/>
               </w:rPr>
-              <w:instrText xml:space="preserve"> PAGEREF _Toc233786864 \h </w:instrText>
+              <w:instrText xml:space="preserve"> PAGEREF _Toc233815397 \h </w:instrText>
             </w:r>
             <w:r>
               <w:rPr>
@@ -222,7 +222,7 @@
               <w14:ligatures w14:val="standardContextual"/>
             </w:rPr>
           </w:pPr>
-          <w:hyperlink w:anchor="_Toc233786865" w:history="1">
+          <w:hyperlink w:anchor="_Toc233815398" w:history="1">
             <w:r>
               <w:rPr>
                 <w:rStyle w:val="Hyperlink"/>
@@ -249,7 +249,7 @@
                 <w:noProof/>
                 <w:webHidden/>
               </w:rPr>
-              <w:instrText xml:space="preserve"> PAGEREF _Toc233786865 \h </w:instrText>
+              <w:instrText xml:space="preserve"> PAGEREF _Toc233815398 \h </w:instrText>
             </w:r>
             <w:r>
               <w:rPr>
@@ -293,7 +293,7 @@
               <w14:ligatures w14:val="standardContextual"/>
             </w:rPr>
           </w:pPr>
-          <w:hyperlink w:anchor="_Toc233786866" w:history="1">
+          <w:hyperlink w:anchor="_Toc233815399" w:history="1">
             <w:r>
               <w:rPr>
                 <w:rStyle w:val="Hyperlink"/>
@@ -320,7 +320,7 @@
                 <w:noProof/>
                 <w:webHidden/>
               </w:rPr>
-              <w:instrText xml:space="preserve"> PAGEREF _Toc233786866 \h </w:instrText>
+              <w:instrText xml:space="preserve"> PAGEREF _Toc233815399 \h </w:instrText>
             </w:r>
             <w:r>
               <w:rPr>
@@ -364,7 +364,7 @@
               <w14:ligatures w14:val="standardContextual"/>
             </w:rPr>
           </w:pPr>
-          <w:hyperlink w:anchor="_Toc233786867" w:history="1">
+          <w:hyperlink w:anchor="_Toc233815400" w:history="1">
             <w:r>
               <w:rPr>
                 <w:rStyle w:val="Hyperlink"/>
@@ -391,7 +391,7 @@
                 <w:noProof/>
                 <w:webHidden/>
               </w:rPr>
-              <w:instrText xml:space="preserve"> PAGEREF _Toc233786867 \h </w:instrText>
+              <w:instrText xml:space="preserve"> PAGEREF _Toc233815400 \h </w:instrText>
             </w:r>
             <w:r>
               <w:rPr>
@@ -435,7 +435,7 @@
               <w14:ligatures w14:val="standardContextual"/>
             </w:rPr>
           </w:pPr>
-          <w:hyperlink w:anchor="_Toc233786868" w:history="1">
+          <w:hyperlink w:anchor="_Toc233815401" w:history="1">
             <w:r>
               <w:rPr>
                 <w:rStyle w:val="Hyperlink"/>
@@ -462,7 +462,7 @@
                 <w:noProof/>
                 <w:webHidden/>
               </w:rPr>
-              <w:instrText xml:space="preserve"> PAGEREF _Toc233786868 \h </w:instrText>
+              <w:instrText xml:space="preserve"> PAGEREF _Toc233815401 \h </w:instrText>
             </w:r>
             <w:r>
               <w:rPr>
@@ -506,7 +506,7 @@
               <w14:ligatures w14:val="standardContextual"/>
             </w:rPr>
           </w:pPr>
-          <w:hyperlink w:anchor="_Toc233786869" w:history="1">
+          <w:hyperlink w:anchor="_Toc233815402" w:history="1">
             <w:r>
               <w:rPr>
                 <w:rStyle w:val="Hyperlink"/>
@@ -533,7 +533,7 @@
                 <w:noProof/>
                 <w:webHidden/>
               </w:rPr>
-              <w:instrText xml:space="preserve"> PAGEREF _Toc233786869 \h </w:instrText>
+              <w:instrText xml:space="preserve"> PAGEREF _Toc233815402 \h </w:instrText>
             </w:r>
             <w:r>
               <w:rPr>
@@ -577,7 +577,7 @@
               <w14:ligatures w14:val="standardContextual"/>
             </w:rPr>
           </w:pPr>
-          <w:hyperlink w:anchor="_Toc233786870" w:history="1">
+          <w:hyperlink w:anchor="_Toc233815403" w:history="1">
             <w:r>
               <w:rPr>
                 <w:rStyle w:val="Hyperlink"/>
@@ -604,7 +604,7 @@
                 <w:noProof/>
                 <w:webHidden/>
               </w:rPr>
-              <w:instrText xml:space="preserve"> PAGEREF _Toc233786870 \h </w:instrText>
+              <w:instrText xml:space="preserve"> PAGEREF _Toc233815403 \h </w:instrText>
             </w:r>
             <w:r>
               <w:rPr>
@@ -648,7 +648,7 @@
               <w14:ligatures w14:val="standardContextual"/>
             </w:rPr>
           </w:pPr>
-          <w:hyperlink w:anchor="_Toc233786871" w:history="1">
+          <w:hyperlink w:anchor="_Toc233815404" w:history="1">
             <w:r>
               <w:rPr>
                 <w:rStyle w:val="Hyperlink"/>
@@ -675,7 +675,7 @@
                 <w:noProof/>
                 <w:webHidden/>
               </w:rPr>
-              <w:instrText xml:space="preserve"> PAGEREF _Toc233786871 \h </w:instrText>
+              <w:instrText xml:space="preserve"> PAGEREF _Toc233815404 \h </w:instrText>
             </w:r>
             <w:r>
               <w:rPr>
@@ -719,7 +719,7 @@
               <w14:ligatures w14:val="standardContextual"/>
             </w:rPr>
           </w:pPr>
-          <w:hyperlink w:anchor="_Toc233786872" w:history="1">
+          <w:hyperlink w:anchor="_Toc233815405" w:history="1">
             <w:r>
               <w:rPr>
                 <w:rStyle w:val="Hyperlink"/>
@@ -746,7 +746,7 @@
                 <w:noProof/>
                 <w:webHidden/>
               </w:rPr>
-              <w:instrText xml:space="preserve"> PAGEREF _Toc233786872 \h </w:instrText>
+              <w:instrText xml:space="preserve"> PAGEREF _Toc233815405 \h </w:instrText>
             </w:r>
             <w:r>
               <w:rPr>
@@ -790,7 +790,7 @@
               <w14:ligatures w14:val="standardContextual"/>
             </w:rPr>
           </w:pPr>
-          <w:hyperlink w:anchor="_Toc233786873" w:history="1">
+          <w:hyperlink w:anchor="_Toc233815406" w:history="1">
             <w:r>
               <w:rPr>
                 <w:rStyle w:val="Hyperlink"/>
@@ -817,7 +817,7 @@
                 <w:noProof/>
                 <w:webHidden/>
               </w:rPr>
-              <w:instrText xml:space="preserve"> PAGEREF _Toc233786873 \h </w:instrText>
+              <w:instrText xml:space="preserve"> PAGEREF _Toc233815406 \h </w:instrText>
             </w:r>
             <w:r>
               <w:rPr>
@@ -861,7 +861,7 @@
               <w14:ligatures w14:val="standardContextual"/>
             </w:rPr>
           </w:pPr>
-          <w:hyperlink w:anchor="_Toc233786874" w:history="1">
+          <w:hyperlink w:anchor="_Toc233815407" w:history="1">
             <w:r>
               <w:rPr>
                 <w:rStyle w:val="Hyperlink"/>
@@ -888,7 +888,7 @@
                 <w:noProof/>
                 <w:webHidden/>
               </w:rPr>
-              <w:instrText xml:space="preserve"> PAGEREF _Toc233786874 \h </w:instrText>
+              <w:instrText xml:space="preserve"> PAGEREF _Toc233815407 \h </w:instrText>
             </w:r>
             <w:r>
               <w:rPr>
@@ -932,7 +932,7 @@
               <w14:ligatures w14:val="standardContextual"/>
             </w:rPr>
           </w:pPr>
-          <w:hyperlink w:anchor="_Toc233786875" w:history="1">
+          <w:hyperlink w:anchor="_Toc233815408" w:history="1">
             <w:r>
               <w:rPr>
                 <w:rStyle w:val="Hyperlink"/>
@@ -959,7 +959,7 @@
                 <w:noProof/>
                 <w:webHidden/>
               </w:rPr>
-              <w:instrText xml:space="preserve"> PAGEREF _Toc233786875 \h </w:instrText>
+              <w:instrText xml:space="preserve"> PAGEREF _Toc233815408 \h </w:instrText>
             </w:r>
             <w:r>
               <w:rPr>
@@ -1003,7 +1003,7 @@
               <w14:ligatures w14:val="standardContextual"/>
             </w:rPr>
           </w:pPr>
-          <w:hyperlink w:anchor="_Toc233786876" w:history="1">
+          <w:hyperlink w:anchor="_Toc233815409" w:history="1">
             <w:r>
               <w:rPr>
                 <w:rStyle w:val="Hyperlink"/>
@@ -1030,7 +1030,7 @@
                 <w:noProof/>
                 <w:webHidden/>
               </w:rPr>
-              <w:instrText xml:space="preserve"> PAGEREF _Toc233786876 \h </w:instrText>
+              <w:instrText xml:space="preserve"> PAGEREF _Toc233815409 \h </w:instrText>
             </w:r>
             <w:r>
               <w:rPr>
@@ -1074,7 +1074,7 @@
               <w14:ligatures w14:val="standardContextual"/>
             </w:rPr>
           </w:pPr>
-          <w:hyperlink w:anchor="_Toc233786877" w:history="1">
+          <w:hyperlink w:anchor="_Toc233815410" w:history="1">
             <w:r>
               <w:rPr>
                 <w:rStyle w:val="Hyperlink"/>
@@ -1101,7 +1101,7 @@
                 <w:noProof/>
                 <w:webHidden/>
               </w:rPr>
-              <w:instrText xml:space="preserve"> PAGEREF _Toc233786877 \h </w:instrText>
+              <w:instrText xml:space="preserve"> PAGEREF _Toc233815410 \h </w:instrText>
             </w:r>
             <w:r>
               <w:rPr>
@@ -1145,7 +1145,7 @@
               <w14:ligatures w14:val="standardContextual"/>
             </w:rPr>
           </w:pPr>
-          <w:hyperlink w:anchor="_Toc233786878" w:history="1">
+          <w:hyperlink w:anchor="_Toc233815411" w:history="1">
             <w:r>
               <w:rPr>
                 <w:rStyle w:val="Hyperlink"/>
@@ -1172,7 +1172,7 @@
                 <w:noProof/>
                 <w:webHidden/>
               </w:rPr>
-              <w:instrText xml:space="preserve"> PAGEREF _Toc233786878 \h </w:instrText>
+              <w:instrText xml:space="preserve"> PAGEREF _Toc233815411 \h </w:instrText>
             </w:r>
             <w:r>
               <w:rPr>
@@ -1216,7 +1216,7 @@
               <w14:ligatures w14:val="standardContextual"/>
             </w:rPr>
           </w:pPr>
-          <w:hyperlink w:anchor="_Toc233786879" w:history="1">
+          <w:hyperlink w:anchor="_Toc233815412" w:history="1">
             <w:r>
               <w:rPr>
                 <w:rStyle w:val="Hyperlink"/>
@@ -1243,7 +1243,7 @@
                 <w:noProof/>
                 <w:webHidden/>
               </w:rPr>
-              <w:instrText xml:space="preserve"> PAGEREF _Toc233786879 \h </w:instrText>
+              <w:instrText xml:space="preserve"> PAGEREF _Toc233815412 \h </w:instrText>
             </w:r>
             <w:r>
               <w:rPr>
@@ -1287,7 +1287,7 @@
               <w14:ligatures w14:val="standardContextual"/>
             </w:rPr>
           </w:pPr>
-          <w:hyperlink w:anchor="_Toc233786880" w:history="1">
+          <w:hyperlink w:anchor="_Toc233815413" w:history="1">
             <w:r>
               <w:rPr>
                 <w:rStyle w:val="Hyperlink"/>
@@ -1314,7 +1314,7 @@
                 <w:noProof/>
                 <w:webHidden/>
               </w:rPr>
-              <w:instrText xml:space="preserve"> PAGEREF _Toc233786880 \h </w:instrText>
+              <w:instrText xml:space="preserve"> PAGEREF _Toc233815413 \h </w:instrText>
             </w:r>
             <w:r>
               <w:rPr>
@@ -1358,7 +1358,7 @@
               <w14:ligatures w14:val="standardContextual"/>
             </w:rPr>
           </w:pPr>
-          <w:hyperlink w:anchor="_Toc233786881" w:history="1">
+          <w:hyperlink w:anchor="_Toc233815414" w:history="1">
             <w:r>
               <w:rPr>
                 <w:rStyle w:val="Hyperlink"/>
@@ -1385,7 +1385,7 @@
                 <w:noProof/>
                 <w:webHidden/>
               </w:rPr>
-              <w:instrText xml:space="preserve"> PAGEREF _Toc233786881 \h </w:instrText>
+              <w:instrText xml:space="preserve"> PAGEREF _Toc233815414 \h </w:instrText>
             </w:r>
             <w:r>
               <w:rPr>
@@ -1429,7 +1429,7 @@
               <w14:ligatures w14:val="standardContextual"/>
             </w:rPr>
           </w:pPr>
-          <w:hyperlink w:anchor="_Toc233786882" w:history="1">
+          <w:hyperlink w:anchor="_Toc233815415" w:history="1">
             <w:r>
               <w:rPr>
                 <w:rStyle w:val="Hyperlink"/>
@@ -1456,7 +1456,7 @@
                 <w:noProof/>
                 <w:webHidden/>
               </w:rPr>
-              <w:instrText xml:space="preserve"> PAGEREF _Toc233786882 \h </w:instrText>
+              <w:instrText xml:space="preserve"> PAGEREF _Toc233815415 \h </w:instrText>
             </w:r>
             <w:r>
               <w:rPr>
@@ -1500,7 +1500,7 @@
               <w14:ligatures w14:val="standardContextual"/>
             </w:rPr>
           </w:pPr>
-          <w:hyperlink w:anchor="_Toc233786883" w:history="1">
+          <w:hyperlink w:anchor="_Toc233815416" w:history="1">
             <w:r>
               <w:rPr>
                 <w:rStyle w:val="Hyperlink"/>
@@ -1527,7 +1527,7 @@
                 <w:noProof/>
                 <w:webHidden/>
               </w:rPr>
-              <w:instrText xml:space="preserve"> PAGEREF _Toc233786883 \h </w:instrText>
+              <w:instrText xml:space="preserve"> PAGEREF _Toc233815416 \h </w:instrText>
             </w:r>
             <w:r>
               <w:rPr>
@@ -1571,7 +1571,7 @@
               <w14:ligatures w14:val="standardContextual"/>
             </w:rPr>
           </w:pPr>
-          <w:hyperlink w:anchor="_Toc233786884" w:history="1">
+          <w:hyperlink w:anchor="_Toc233815417" w:history="1">
             <w:r>
               <w:rPr>
                 <w:rStyle w:val="Hyperlink"/>
@@ -1598,7 +1598,7 @@
                 <w:noProof/>
                 <w:webHidden/>
               </w:rPr>
-              <w:instrText xml:space="preserve"> PAGEREF _Toc233786884 \h </w:instrText>
+              <w:instrText xml:space="preserve"> PAGEREF _Toc233815417 \h </w:instrText>
             </w:r>
             <w:r>
               <w:rPr>
@@ -1642,7 +1642,7 @@
               <w14:ligatures w14:val="standardContextual"/>
             </w:rPr>
           </w:pPr>
-          <w:hyperlink w:anchor="_Toc233786885" w:history="1">
+          <w:hyperlink w:anchor="_Toc233815418" w:history="1">
             <w:r>
               <w:rPr>
                 <w:rStyle w:val="Hyperlink"/>
@@ -1669,7 +1669,7 @@
                 <w:noProof/>
                 <w:webHidden/>
               </w:rPr>
-              <w:instrText xml:space="preserve"> PAGEREF _Toc233786885 \h </w:instrText>
+              <w:instrText xml:space="preserve"> PAGEREF _Toc233815418 \h </w:instrText>
             </w:r>
             <w:r>
               <w:rPr>
@@ -1713,7 +1713,7 @@
               <w14:ligatures w14:val="standardContextual"/>
             </w:rPr>
           </w:pPr>
-          <w:hyperlink w:anchor="_Toc233786886" w:history="1">
+          <w:hyperlink w:anchor="_Toc233815419" w:history="1">
             <w:r>
               <w:rPr>
                 <w:rStyle w:val="Hyperlink"/>
@@ -1740,7 +1740,7 @@
                 <w:noProof/>
                 <w:webHidden/>
               </w:rPr>
-              <w:instrText xml:space="preserve"> PAGEREF _Toc233786886 \h </w:instrText>
+              <w:instrText xml:space="preserve"> PAGEREF _Toc233815419 \h </w:instrText>
             </w:r>
             <w:r>
               <w:rPr>
@@ -1784,7 +1784,7 @@
               <w14:ligatures w14:val="standardContextual"/>
             </w:rPr>
           </w:pPr>
-          <w:hyperlink w:anchor="_Toc233786887" w:history="1">
+          <w:hyperlink w:anchor="_Toc233815420" w:history="1">
             <w:r>
               <w:rPr>
                 <w:rStyle w:val="Hyperlink"/>
@@ -1811,7 +1811,7 @@
                 <w:noProof/>
                 <w:webHidden/>
               </w:rPr>
-              <w:instrText xml:space="preserve"> PAGEREF _Toc233786887 \h </w:instrText>
+              <w:instrText xml:space="preserve"> PAGEREF _Toc233815420 \h </w:instrText>
             </w:r>
             <w:r>
               <w:rPr>
@@ -1855,7 +1855,7 @@
               <w14:ligatures w14:val="standardContextual"/>
             </w:rPr>
           </w:pPr>
-          <w:hyperlink w:anchor="_Toc233786888" w:history="1">
+          <w:hyperlink w:anchor="_Toc233815421" w:history="1">
             <w:r>
               <w:rPr>
                 <w:rStyle w:val="Hyperlink"/>
@@ -1882,7 +1882,7 @@
                 <w:noProof/>
                 <w:webHidden/>
               </w:rPr>
-              <w:instrText xml:space="preserve"> PAGEREF _Toc233786888 \h </w:instrText>
+              <w:instrText xml:space="preserve"> PAGEREF _Toc233815421 \h </w:instrText>
             </w:r>
             <w:r>
               <w:rPr>
@@ -1926,7 +1926,7 @@
               <w14:ligatures w14:val="standardContextual"/>
             </w:rPr>
           </w:pPr>
-          <w:hyperlink w:anchor="_Toc233786889" w:history="1">
+          <w:hyperlink w:anchor="_Toc233815422" w:history="1">
             <w:r>
               <w:rPr>
                 <w:rStyle w:val="Hyperlink"/>
@@ -1953,7 +1953,7 @@
                 <w:noProof/>
                 <w:webHidden/>
               </w:rPr>
-              <w:instrText xml:space="preserve"> PAGEREF _Toc233786889 \h </w:instrText>
+              <w:instrText xml:space="preserve"> PAGEREF _Toc233815422 \h </w:instrText>
             </w:r>
             <w:r>
               <w:rPr>
@@ -1973,7 +1973,7 @@
                 <w:noProof/>
                 <w:webHidden/>
               </w:rPr>
-              <w:t>19</w:t>
+              <w:t>18</w:t>
             </w:r>
             <w:r>
               <w:rPr>
@@ -1997,7 +1997,7 @@
               <w14:ligatures w14:val="standardContextual"/>
             </w:rPr>
           </w:pPr>
-          <w:hyperlink w:anchor="_Toc233786890" w:history="1">
+          <w:hyperlink w:anchor="_Toc233815423" w:history="1">
             <w:r>
               <w:rPr>
                 <w:rStyle w:val="Hyperlink"/>
@@ -2024,7 +2024,7 @@
                 <w:noProof/>
                 <w:webHidden/>
               </w:rPr>
-              <w:instrText xml:space="preserve"> PAGEREF _Toc233786890 \h </w:instrText>
+              <w:instrText xml:space="preserve"> PAGEREF _Toc233815423 \h </w:instrText>
             </w:r>
             <w:r>
               <w:rPr>
@@ -2068,7 +2068,7 @@
               <w14:ligatures w14:val="standardContextual"/>
             </w:rPr>
           </w:pPr>
-          <w:hyperlink w:anchor="_Toc233786891" w:history="1">
+          <w:hyperlink w:anchor="_Toc233815424" w:history="1">
             <w:r>
               <w:rPr>
                 <w:rStyle w:val="Hyperlink"/>
@@ -2095,7 +2095,7 @@
                 <w:noProof/>
                 <w:webHidden/>
               </w:rPr>
-              <w:instrText xml:space="preserve"> PAGEREF _Toc233786891 \h </w:instrText>
+              <w:instrText xml:space="preserve"> PAGEREF _Toc233815424 \h </w:instrText>
             </w:r>
             <w:r>
               <w:rPr>
@@ -2139,7 +2139,7 @@
               <w14:ligatures w14:val="standardContextual"/>
             </w:rPr>
           </w:pPr>
-          <w:hyperlink w:anchor="_Toc233786892" w:history="1">
+          <w:hyperlink w:anchor="_Toc233815425" w:history="1">
             <w:r>
               <w:rPr>
                 <w:rStyle w:val="Hyperlink"/>
@@ -2166,7 +2166,7 @@
                 <w:noProof/>
                 <w:webHidden/>
               </w:rPr>
-              <w:instrText xml:space="preserve"> PAGEREF _Toc233786892 \h </w:instrText>
+              <w:instrText xml:space="preserve"> PAGEREF _Toc233815425 \h </w:instrText>
             </w:r>
             <w:r>
               <w:rPr>
@@ -2186,7 +2186,7 @@
                 <w:noProof/>
                 <w:webHidden/>
               </w:rPr>
-              <w:t>21</w:t>
+              <w:t>20</w:t>
             </w:r>
             <w:r>
               <w:rPr>
@@ -2210,7 +2210,7 @@
               <w14:ligatures w14:val="standardContextual"/>
             </w:rPr>
           </w:pPr>
-          <w:hyperlink w:anchor="_Toc233786893" w:history="1">
+          <w:hyperlink w:anchor="_Toc233815426" w:history="1">
             <w:r>
               <w:rPr>
                 <w:rStyle w:val="Hyperlink"/>
@@ -2237,7 +2237,7 @@
                 <w:noProof/>
                 <w:webHidden/>
               </w:rPr>
-              <w:instrText xml:space="preserve"> PAGEREF _Toc233786893 \h </w:instrText>
+              <w:instrText xml:space="preserve"> PAGEREF _Toc233815426 \h </w:instrText>
             </w:r>
             <w:r>
               <w:rPr>
@@ -2281,7 +2281,7 @@
               <w14:ligatures w14:val="standardContextual"/>
             </w:rPr>
           </w:pPr>
-          <w:hyperlink w:anchor="_Toc233786894" w:history="1">
+          <w:hyperlink w:anchor="_Toc233815427" w:history="1">
             <w:r>
               <w:rPr>
                 <w:rStyle w:val="Hyperlink"/>
@@ -2308,7 +2308,7 @@
                 <w:noProof/>
                 <w:webHidden/>
               </w:rPr>
-              <w:instrText xml:space="preserve"> PAGEREF _Toc233786894 \h </w:instrText>
+              <w:instrText xml:space="preserve"> PAGEREF _Toc233815427 \h </w:instrText>
             </w:r>
             <w:r>
               <w:rPr>
@@ -2328,7 +2328,7 @@
                 <w:noProof/>
                 <w:webHidden/>
               </w:rPr>
-              <w:t>22</w:t>
+              <w:t>21</w:t>
             </w:r>
             <w:r>
               <w:rPr>
@@ -2352,7 +2352,7 @@
               <w14:ligatures w14:val="standardContextual"/>
             </w:rPr>
           </w:pPr>
-          <w:hyperlink w:anchor="_Toc233786895" w:history="1">
+          <w:hyperlink w:anchor="_Toc233815428" w:history="1">
             <w:r>
               <w:rPr>
                 <w:rStyle w:val="Hyperlink"/>
@@ -2379,7 +2379,7 @@
                 <w:noProof/>
                 <w:webHidden/>
               </w:rPr>
-              <w:instrText xml:space="preserve"> PAGEREF _Toc233786895 \h </w:instrText>
+              <w:instrText xml:space="preserve"> PAGEREF _Toc233815428 \h </w:instrText>
             </w:r>
             <w:r>
               <w:rPr>
@@ -2399,7 +2399,7 @@
                 <w:noProof/>
                 <w:webHidden/>
               </w:rPr>
-              <w:t>22</w:t>
+              <w:t>21</w:t>
             </w:r>
             <w:r>
               <w:rPr>
@@ -2423,7 +2423,7 @@
               <w14:ligatures w14:val="standardContextual"/>
             </w:rPr>
           </w:pPr>
-          <w:hyperlink w:anchor="_Toc233786896" w:history="1">
+          <w:hyperlink w:anchor="_Toc233815429" w:history="1">
             <w:r>
               <w:rPr>
                 <w:rStyle w:val="Hyperlink"/>
@@ -2450,7 +2450,7 @@
                 <w:noProof/>
                 <w:webHidden/>
               </w:rPr>
-              <w:instrText xml:space="preserve"> PAGEREF _Toc233786896 \h </w:instrText>
+              <w:instrText xml:space="preserve"> PAGEREF _Toc233815429 \h </w:instrText>
             </w:r>
             <w:r>
               <w:rPr>
@@ -2494,7 +2494,7 @@
               <w14:ligatures w14:val="standardContextual"/>
             </w:rPr>
           </w:pPr>
-          <w:hyperlink w:anchor="_Toc233786897" w:history="1">
+          <w:hyperlink w:anchor="_Toc233815430" w:history="1">
             <w:r>
               <w:rPr>
                 <w:rStyle w:val="Hyperlink"/>
@@ -2521,7 +2521,7 @@
                 <w:noProof/>
                 <w:webHidden/>
               </w:rPr>
-              <w:instrText xml:space="preserve"> PAGEREF _Toc233786897 \h </w:instrText>
+              <w:instrText xml:space="preserve"> PAGEREF _Toc233815430 \h </w:instrText>
             </w:r>
             <w:r>
               <w:rPr>
@@ -2541,7 +2541,7 @@
                 <w:noProof/>
                 <w:webHidden/>
               </w:rPr>
-              <w:t>23</w:t>
+              <w:t>22</w:t>
             </w:r>
             <w:r>
               <w:rPr>
@@ -2683,7 +2683,7 @@
         <w:pStyle w:val="Heading1"/>
       </w:pPr>
       <w:bookmarkStart w:id="0" w:name="the-n8nn-the-front-door-to-the-agency"/>
-      <w:bookmarkStart w:id="1" w:name="_Toc233786863"/>
+      <w:bookmarkStart w:id="1" w:name="_Toc233815396"/>
       <w:r>
         <w:t>1. The N8NN: The Front Door to the Agency</w:t>
       </w:r>
@@ -2698,7 +2698,7 @@
           <w:noProof/>
         </w:rPr>
         <w:drawing>
-          <wp:inline distT="0" distB="0" distL="0" distR="0" wp14:anchorId="75A52804" wp14:editId="5BFD1178">
+          <wp:inline distT="0" distB="0" distL="0" distR="0" wp14:anchorId="54E95C40" wp14:editId="1784DAC5">
             <wp:extent cx="5334000" cy="2844800"/>
             <wp:effectExtent l="0" t="0" r="0" b="0"/>
             <wp:docPr id="10" name="Picture" descr="The N8NN Call Journey: From Citizen to Agent"/>
@@ -2800,7 +2800,7 @@
         <w:pStyle w:val="Heading1"/>
       </w:pPr>
       <w:bookmarkStart w:id="2" w:name="Xca87ad3e66249f197630568f46fbf6f37ec629f"/>
-      <w:bookmarkStart w:id="3" w:name="_Toc233786864"/>
+      <w:bookmarkStart w:id="3" w:name="_Toc233815397"/>
       <w:bookmarkEnd w:id="0"/>
       <w:r>
         <w:t>2. The Physics of Voice: Standards With a Pass/Fail Threshold</w:t>
@@ -2824,7 +2824,7 @@
           <w:noProof/>
         </w:rPr>
         <w:drawing>
-          <wp:inline distT="0" distB="0" distL="0" distR="0" wp14:anchorId="169417B7" wp14:editId="4A5E8944">
+          <wp:inline distT="0" distB="0" distL="0" distR="0" wp14:anchorId="5EC97109" wp14:editId="71024C52">
             <wp:extent cx="5334000" cy="2844800"/>
             <wp:effectExtent l="0" t="0" r="0" b="0"/>
             <wp:docPr id="14" name="Picture" descr="Voice Quality: MOS Scale and G.114 One-Way Delay Budget"/>
@@ -2879,7 +2879,7 @@
         <w:pStyle w:val="Heading2"/>
       </w:pPr>
       <w:bookmarkStart w:id="4" w:name="itu-t-g.114-the-one-way-delay-limit"/>
-      <w:bookmarkStart w:id="5" w:name="_Toc233786865"/>
+      <w:bookmarkStart w:id="5" w:name="_Toc233815398"/>
       <w:r>
         <w:t>2.1 ITU-T G.114: The One-Way Delay Limit</w:t>
       </w:r>
@@ -2926,7 +2926,7 @@
         <w:pStyle w:val="Heading2"/>
       </w:pPr>
       <w:bookmarkStart w:id="6" w:name="Xf57f72c6e8a3ffa36d8cca3ce9684e69654893e"/>
-      <w:bookmarkStart w:id="7" w:name="_Toc233786866"/>
+      <w:bookmarkStart w:id="7" w:name="_Toc233815399"/>
       <w:bookmarkEnd w:id="4"/>
       <w:r>
         <w:t>2.2 MOS and the E-Model: Quantifying Call Quality</w:t>
@@ -2944,17 +2944,18 @@
     <w:tbl>
       <w:tblPr>
         <w:tblStyle w:val="Table"/>
-        <w:tblW w:w="9360" w:type="dxa"/>
-        <w:tblLook w:val="0600" w:firstRow="0" w:lastRow="0" w:firstColumn="0" w:lastColumn="0" w:noHBand="1" w:noVBand="1"/>
+        <w:tblW w:w="0" w:type="auto"/>
+        <w:tblLook w:val="0020" w:firstRow="1" w:lastRow="0" w:firstColumn="0" w:lastColumn="0" w:noHBand="0" w:noVBand="0"/>
       </w:tblPr>
       <w:tblGrid>
-        <w:gridCol w:w="1457"/>
-        <w:gridCol w:w="1539"/>
-        <w:gridCol w:w="1468"/>
-        <w:gridCol w:w="4896"/>
+        <w:gridCol w:w="1004"/>
+        <w:gridCol w:w="1061"/>
+        <w:gridCol w:w="1011"/>
+        <w:gridCol w:w="3428"/>
       </w:tblGrid>
       <w:tr>
         <w:trPr>
+          <w:cnfStyle w:val="100000000000" w:firstRow="1" w:lastRow="0" w:firstColumn="0" w:lastColumn="0" w:oddVBand="0" w:evenVBand="0" w:oddHBand="0" w:evenHBand="0" w:firstRowFirstColumn="0" w:firstRowLastColumn="0" w:lastRowFirstColumn="0" w:lastRowLastColumn="0"/>
           <w:tblHeader/>
         </w:trPr>
         <w:tc>
@@ -2967,12 +2968,6 @@
               <w:right w:val="single" w:sz="4" w:space="0" w:color="C8D0DC"/>
             </w:tcBorders>
             <w:shd w:val="clear" w:color="auto" w:fill="1F3864"/>
-            <w:tcMar>
-              <w:top w:w="80" w:type="dxa"/>
-              <w:left w:w="120" w:type="dxa"/>
-              <w:bottom w:w="80" w:type="dxa"/>
-              <w:right w:w="120" w:type="dxa"/>
-            </w:tcMar>
           </w:tcPr>
           <w:p>
             <w:pPr>
@@ -2998,12 +2993,6 @@
               <w:right w:val="single" w:sz="4" w:space="0" w:color="C8D0DC"/>
             </w:tcBorders>
             <w:shd w:val="clear" w:color="auto" w:fill="1F3864"/>
-            <w:tcMar>
-              <w:top w:w="80" w:type="dxa"/>
-              <w:left w:w="120" w:type="dxa"/>
-              <w:bottom w:w="80" w:type="dxa"/>
-              <w:right w:w="120" w:type="dxa"/>
-            </w:tcMar>
           </w:tcPr>
           <w:p>
             <w:pPr>
@@ -3029,12 +3018,6 @@
               <w:right w:val="single" w:sz="4" w:space="0" w:color="C8D0DC"/>
             </w:tcBorders>
             <w:shd w:val="clear" w:color="auto" w:fill="1F3864"/>
-            <w:tcMar>
-              <w:top w:w="80" w:type="dxa"/>
-              <w:left w:w="120" w:type="dxa"/>
-              <w:bottom w:w="80" w:type="dxa"/>
-              <w:right w:w="120" w:type="dxa"/>
-            </w:tcMar>
           </w:tcPr>
           <w:p>
             <w:pPr>
@@ -3060,12 +3043,6 @@
               <w:right w:val="single" w:sz="4" w:space="0" w:color="C8D0DC"/>
             </w:tcBorders>
             <w:shd w:val="clear" w:color="auto" w:fill="1F3864"/>
-            <w:tcMar>
-              <w:top w:w="80" w:type="dxa"/>
-              <w:left w:w="120" w:type="dxa"/>
-              <w:bottom w:w="80" w:type="dxa"/>
-              <w:right w:w="120" w:type="dxa"/>
-            </w:tcMar>
           </w:tcPr>
           <w:p>
             <w:pPr>
@@ -3093,12 +3070,6 @@
               <w:right w:val="single" w:sz="4" w:space="0" w:color="C8D0DC"/>
             </w:tcBorders>
             <w:shd w:val="clear" w:color="auto" w:fill="FFFFFF"/>
-            <w:tcMar>
-              <w:top w:w="80" w:type="dxa"/>
-              <w:left w:w="120" w:type="dxa"/>
-              <w:bottom w:w="80" w:type="dxa"/>
-              <w:right w:w="120" w:type="dxa"/>
-            </w:tcMar>
           </w:tcPr>
           <w:p>
             <w:pPr>
@@ -3122,12 +3093,6 @@
               <w:right w:val="single" w:sz="4" w:space="0" w:color="C8D0DC"/>
             </w:tcBorders>
             <w:shd w:val="clear" w:color="auto" w:fill="FFFFFF"/>
-            <w:tcMar>
-              <w:top w:w="80" w:type="dxa"/>
-              <w:left w:w="120" w:type="dxa"/>
-              <w:bottom w:w="80" w:type="dxa"/>
-              <w:right w:w="120" w:type="dxa"/>
-            </w:tcMar>
           </w:tcPr>
           <w:p>
             <w:pPr>
@@ -3151,12 +3116,6 @@
               <w:right w:val="single" w:sz="4" w:space="0" w:color="C8D0DC"/>
             </w:tcBorders>
             <w:shd w:val="clear" w:color="auto" w:fill="FFFFFF"/>
-            <w:tcMar>
-              <w:top w:w="80" w:type="dxa"/>
-              <w:left w:w="120" w:type="dxa"/>
-              <w:bottom w:w="80" w:type="dxa"/>
-              <w:right w:w="120" w:type="dxa"/>
-            </w:tcMar>
           </w:tcPr>
           <w:p>
             <w:pPr>
@@ -3180,12 +3139,6 @@
               <w:right w:val="single" w:sz="4" w:space="0" w:color="C8D0DC"/>
             </w:tcBorders>
             <w:shd w:val="clear" w:color="auto" w:fill="FFFFFF"/>
-            <w:tcMar>
-              <w:top w:w="80" w:type="dxa"/>
-              <w:left w:w="120" w:type="dxa"/>
-              <w:bottom w:w="80" w:type="dxa"/>
-              <w:right w:w="120" w:type="dxa"/>
-            </w:tcMar>
           </w:tcPr>
           <w:p>
             <w:pPr>
@@ -3211,12 +3164,6 @@
               <w:right w:val="single" w:sz="4" w:space="0" w:color="C8D0DC"/>
             </w:tcBorders>
             <w:shd w:val="clear" w:color="auto" w:fill="F2F2F2"/>
-            <w:tcMar>
-              <w:top w:w="80" w:type="dxa"/>
-              <w:left w:w="120" w:type="dxa"/>
-              <w:bottom w:w="80" w:type="dxa"/>
-              <w:right w:w="120" w:type="dxa"/>
-            </w:tcMar>
           </w:tcPr>
           <w:p>
             <w:pPr>
@@ -3240,12 +3187,6 @@
               <w:right w:val="single" w:sz="4" w:space="0" w:color="C8D0DC"/>
             </w:tcBorders>
             <w:shd w:val="clear" w:color="auto" w:fill="F2F2F2"/>
-            <w:tcMar>
-              <w:top w:w="80" w:type="dxa"/>
-              <w:left w:w="120" w:type="dxa"/>
-              <w:bottom w:w="80" w:type="dxa"/>
-              <w:right w:w="120" w:type="dxa"/>
-            </w:tcMar>
           </w:tcPr>
           <w:p>
             <w:pPr>
@@ -3269,12 +3210,6 @@
               <w:right w:val="single" w:sz="4" w:space="0" w:color="C8D0DC"/>
             </w:tcBorders>
             <w:shd w:val="clear" w:color="auto" w:fill="F2F2F2"/>
-            <w:tcMar>
-              <w:top w:w="80" w:type="dxa"/>
-              <w:left w:w="120" w:type="dxa"/>
-              <w:bottom w:w="80" w:type="dxa"/>
-              <w:right w:w="120" w:type="dxa"/>
-            </w:tcMar>
           </w:tcPr>
           <w:p>
             <w:pPr>
@@ -3298,12 +3233,6 @@
               <w:right w:val="single" w:sz="4" w:space="0" w:color="C8D0DC"/>
             </w:tcBorders>
             <w:shd w:val="clear" w:color="auto" w:fill="F2F2F2"/>
-            <w:tcMar>
-              <w:top w:w="80" w:type="dxa"/>
-              <w:left w:w="120" w:type="dxa"/>
-              <w:bottom w:w="80" w:type="dxa"/>
-              <w:right w:w="120" w:type="dxa"/>
-            </w:tcMar>
           </w:tcPr>
           <w:p>
             <w:pPr>
@@ -3329,12 +3258,6 @@
               <w:right w:val="single" w:sz="4" w:space="0" w:color="C8D0DC"/>
             </w:tcBorders>
             <w:shd w:val="clear" w:color="auto" w:fill="FFFFFF"/>
-            <w:tcMar>
-              <w:top w:w="80" w:type="dxa"/>
-              <w:left w:w="120" w:type="dxa"/>
-              <w:bottom w:w="80" w:type="dxa"/>
-              <w:right w:w="120" w:type="dxa"/>
-            </w:tcMar>
           </w:tcPr>
           <w:p>
             <w:pPr>
@@ -3358,12 +3281,6 @@
               <w:right w:val="single" w:sz="4" w:space="0" w:color="C8D0DC"/>
             </w:tcBorders>
             <w:shd w:val="clear" w:color="auto" w:fill="FFFFFF"/>
-            <w:tcMar>
-              <w:top w:w="80" w:type="dxa"/>
-              <w:left w:w="120" w:type="dxa"/>
-              <w:bottom w:w="80" w:type="dxa"/>
-              <w:right w:w="120" w:type="dxa"/>
-            </w:tcMar>
           </w:tcPr>
           <w:p>
             <w:pPr>
@@ -3387,12 +3304,6 @@
               <w:right w:val="single" w:sz="4" w:space="0" w:color="C8D0DC"/>
             </w:tcBorders>
             <w:shd w:val="clear" w:color="auto" w:fill="FFFFFF"/>
-            <w:tcMar>
-              <w:top w:w="80" w:type="dxa"/>
-              <w:left w:w="120" w:type="dxa"/>
-              <w:bottom w:w="80" w:type="dxa"/>
-              <w:right w:w="120" w:type="dxa"/>
-            </w:tcMar>
           </w:tcPr>
           <w:p>
             <w:pPr>
@@ -3416,12 +3327,6 @@
               <w:right w:val="single" w:sz="4" w:space="0" w:color="C8D0DC"/>
             </w:tcBorders>
             <w:shd w:val="clear" w:color="auto" w:fill="FFFFFF"/>
-            <w:tcMar>
-              <w:top w:w="80" w:type="dxa"/>
-              <w:left w:w="120" w:type="dxa"/>
-              <w:bottom w:w="80" w:type="dxa"/>
-              <w:right w:w="120" w:type="dxa"/>
-            </w:tcMar>
           </w:tcPr>
           <w:p>
             <w:pPr>
@@ -3447,12 +3352,6 @@
               <w:right w:val="single" w:sz="4" w:space="0" w:color="C8D0DC"/>
             </w:tcBorders>
             <w:shd w:val="clear" w:color="auto" w:fill="F2F2F2"/>
-            <w:tcMar>
-              <w:top w:w="80" w:type="dxa"/>
-              <w:left w:w="120" w:type="dxa"/>
-              <w:bottom w:w="80" w:type="dxa"/>
-              <w:right w:w="120" w:type="dxa"/>
-            </w:tcMar>
           </w:tcPr>
           <w:p>
             <w:pPr>
@@ -3476,12 +3375,6 @@
               <w:right w:val="single" w:sz="4" w:space="0" w:color="C8D0DC"/>
             </w:tcBorders>
             <w:shd w:val="clear" w:color="auto" w:fill="F2F2F2"/>
-            <w:tcMar>
-              <w:top w:w="80" w:type="dxa"/>
-              <w:left w:w="120" w:type="dxa"/>
-              <w:bottom w:w="80" w:type="dxa"/>
-              <w:right w:w="120" w:type="dxa"/>
-            </w:tcMar>
           </w:tcPr>
           <w:p>
             <w:pPr>
@@ -3505,12 +3398,6 @@
               <w:right w:val="single" w:sz="4" w:space="0" w:color="C8D0DC"/>
             </w:tcBorders>
             <w:shd w:val="clear" w:color="auto" w:fill="F2F2F2"/>
-            <w:tcMar>
-              <w:top w:w="80" w:type="dxa"/>
-              <w:left w:w="120" w:type="dxa"/>
-              <w:bottom w:w="80" w:type="dxa"/>
-              <w:right w:w="120" w:type="dxa"/>
-            </w:tcMar>
           </w:tcPr>
           <w:p>
             <w:pPr>
@@ -3534,12 +3421,6 @@
               <w:right w:val="single" w:sz="4" w:space="0" w:color="C8D0DC"/>
             </w:tcBorders>
             <w:shd w:val="clear" w:color="auto" w:fill="F2F2F2"/>
-            <w:tcMar>
-              <w:top w:w="80" w:type="dxa"/>
-              <w:left w:w="120" w:type="dxa"/>
-              <w:bottom w:w="80" w:type="dxa"/>
-              <w:right w:w="120" w:type="dxa"/>
-            </w:tcMar>
           </w:tcPr>
           <w:p>
             <w:pPr>
@@ -3565,12 +3446,6 @@
               <w:right w:val="single" w:sz="4" w:space="0" w:color="C8D0DC"/>
             </w:tcBorders>
             <w:shd w:val="clear" w:color="auto" w:fill="FFFFFF"/>
-            <w:tcMar>
-              <w:top w:w="80" w:type="dxa"/>
-              <w:left w:w="120" w:type="dxa"/>
-              <w:bottom w:w="80" w:type="dxa"/>
-              <w:right w:w="120" w:type="dxa"/>
-            </w:tcMar>
           </w:tcPr>
           <w:p>
             <w:pPr>
@@ -3594,12 +3469,6 @@
               <w:right w:val="single" w:sz="4" w:space="0" w:color="C8D0DC"/>
             </w:tcBorders>
             <w:shd w:val="clear" w:color="auto" w:fill="FFFFFF"/>
-            <w:tcMar>
-              <w:top w:w="80" w:type="dxa"/>
-              <w:left w:w="120" w:type="dxa"/>
-              <w:bottom w:w="80" w:type="dxa"/>
-              <w:right w:w="120" w:type="dxa"/>
-            </w:tcMar>
           </w:tcPr>
           <w:p>
             <w:pPr>
@@ -3623,12 +3492,6 @@
               <w:right w:val="single" w:sz="4" w:space="0" w:color="C8D0DC"/>
             </w:tcBorders>
             <w:shd w:val="clear" w:color="auto" w:fill="FFFFFF"/>
-            <w:tcMar>
-              <w:top w:w="80" w:type="dxa"/>
-              <w:left w:w="120" w:type="dxa"/>
-              <w:bottom w:w="80" w:type="dxa"/>
-              <w:right w:w="120" w:type="dxa"/>
-            </w:tcMar>
           </w:tcPr>
           <w:p>
             <w:pPr>
@@ -3652,12 +3515,6 @@
               <w:right w:val="single" w:sz="4" w:space="0" w:color="C8D0DC"/>
             </w:tcBorders>
             <w:shd w:val="clear" w:color="auto" w:fill="FFFFFF"/>
-            <w:tcMar>
-              <w:top w:w="80" w:type="dxa"/>
-              <w:left w:w="120" w:type="dxa"/>
-              <w:bottom w:w="80" w:type="dxa"/>
-              <w:right w:w="120" w:type="dxa"/>
-            </w:tcMar>
           </w:tcPr>
           <w:p>
             <w:pPr>
@@ -3686,7 +3543,7 @@
         <w:pStyle w:val="Heading2"/>
       </w:pPr>
       <w:bookmarkStart w:id="8" w:name="jitter-and-packet-loss"/>
-      <w:bookmarkStart w:id="9" w:name="_Toc233786867"/>
+      <w:bookmarkStart w:id="9" w:name="_Toc233815400"/>
       <w:bookmarkEnd w:id="6"/>
       <w:r>
         <w:t>2.3 Jitter and Packet Loss</w:t>
@@ -3702,7 +3559,7 @@
           <w:noProof/>
         </w:rPr>
         <w:drawing>
-          <wp:inline distT="0" distB="0" distL="0" distR="0" wp14:anchorId="27C4E1FA" wp14:editId="471DF95B">
+          <wp:inline distT="0" distB="0" distL="0" distR="0" wp14:anchorId="0036CEC5" wp14:editId="51A6FB1C">
             <wp:extent cx="5334000" cy="2726266"/>
             <wp:effectExtent l="0" t="0" r="0" b="0"/>
             <wp:docPr id="19" name="Picture" descr="Voice Packet Arrival: What Network Conditions Sound Like"/>
@@ -3790,7 +3647,7 @@
         <w:pStyle w:val="Heading1"/>
       </w:pPr>
       <w:bookmarkStart w:id="10" w:name="Xe69dcf64720bd173cbba48f84c4f0f805c11880"/>
-      <w:bookmarkStart w:id="11" w:name="_Toc233786868"/>
+      <w:bookmarkStart w:id="11" w:name="_Toc233815401"/>
       <w:bookmarkEnd w:id="2"/>
       <w:bookmarkEnd w:id="8"/>
       <w:r>
@@ -3803,7 +3660,7 @@
         <w:pStyle w:val="Heading2"/>
       </w:pPr>
       <w:bookmarkStart w:id="12" w:name="platform-overview"/>
-      <w:bookmarkStart w:id="13" w:name="_Toc233786869"/>
+      <w:bookmarkStart w:id="13" w:name="_Toc233815402"/>
       <w:r>
         <w:t>3.1 Platform Overview</w:t>
       </w:r>
@@ -3826,7 +3683,7 @@
           <w:noProof/>
         </w:rPr>
         <w:drawing>
-          <wp:inline distT="0" distB="0" distL="0" distR="0" wp14:anchorId="63F3E11D" wp14:editId="1E0FF333">
+          <wp:inline distT="0" distB="0" distL="0" distR="0" wp14:anchorId="0DFC4D13" wp14:editId="232582FC">
             <wp:extent cx="5334000" cy="2844800"/>
             <wp:effectExtent l="0" t="0" r="0" b="0"/>
             <wp:docPr id="24" name="Picture" descr="Amazon Connect: AWS GovCloud .us vs. AWS Commercial .com — The Authorized Exception"/>
@@ -3881,7 +3738,7 @@
         <w:pStyle w:val="Heading2"/>
       </w:pPr>
       <w:bookmarkStart w:id="14" w:name="X57dc57e6d8d433f201474365cce1ca7682cef30"/>
-      <w:bookmarkStart w:id="15" w:name="_Toc233786870"/>
+      <w:bookmarkStart w:id="15" w:name="_Toc233815403"/>
       <w:bookmarkEnd w:id="12"/>
       <w:r>
         <w:t>3.2 The .us vs. .com Decision and the Authorized Exception</w:t>
@@ -3899,17 +3756,18 @@
     <w:tbl>
       <w:tblPr>
         <w:tblStyle w:val="Table"/>
-        <w:tblW w:w="9360" w:type="dxa"/>
+        <w:tblW w:w="5000" w:type="pct"/>
         <w:tblLayout w:type="fixed"/>
-        <w:tblLook w:val="0600" w:firstRow="0" w:lastRow="0" w:firstColumn="0" w:lastColumn="0" w:noHBand="1" w:noVBand="1"/>
+        <w:tblLook w:val="0020" w:firstRow="1" w:lastRow="0" w:firstColumn="0" w:lastColumn="0" w:noHBand="0" w:noVBand="0"/>
       </w:tblPr>
       <w:tblGrid>
-        <w:gridCol w:w="1671"/>
-        <w:gridCol w:w="4012"/>
-        <w:gridCol w:w="3677"/>
+        <w:gridCol w:w="1710"/>
+        <w:gridCol w:w="4104"/>
+        <w:gridCol w:w="3762"/>
       </w:tblGrid>
       <w:tr>
         <w:trPr>
+          <w:cnfStyle w:val="100000000000" w:firstRow="1" w:lastRow="0" w:firstColumn="0" w:lastColumn="0" w:oddVBand="0" w:evenVBand="0" w:oddHBand="0" w:evenHBand="0" w:firstRowFirstColumn="0" w:firstRowLastColumn="0" w:lastRowFirstColumn="0" w:lastRowLastColumn="0"/>
           <w:tblHeader/>
         </w:trPr>
         <w:tc>
@@ -3922,12 +3780,6 @@
               <w:right w:val="single" w:sz="4" w:space="0" w:color="C8D0DC"/>
             </w:tcBorders>
             <w:shd w:val="clear" w:color="auto" w:fill="1F3864"/>
-            <w:tcMar>
-              <w:top w:w="80" w:type="dxa"/>
-              <w:left w:w="120" w:type="dxa"/>
-              <w:bottom w:w="80" w:type="dxa"/>
-              <w:right w:w="120" w:type="dxa"/>
-            </w:tcMar>
           </w:tcPr>
           <w:p>
             <w:pPr>
@@ -3953,12 +3805,6 @@
               <w:right w:val="single" w:sz="4" w:space="0" w:color="C8D0DC"/>
             </w:tcBorders>
             <w:shd w:val="clear" w:color="auto" w:fill="1F3864"/>
-            <w:tcMar>
-              <w:top w:w="80" w:type="dxa"/>
-              <w:left w:w="120" w:type="dxa"/>
-              <w:bottom w:w="80" w:type="dxa"/>
-              <w:right w:w="120" w:type="dxa"/>
-            </w:tcMar>
           </w:tcPr>
           <w:p>
             <w:pPr>
@@ -3984,12 +3830,6 @@
               <w:right w:val="single" w:sz="4" w:space="0" w:color="C8D0DC"/>
             </w:tcBorders>
             <w:shd w:val="clear" w:color="auto" w:fill="1F3864"/>
-            <w:tcMar>
-              <w:top w:w="80" w:type="dxa"/>
-              <w:left w:w="120" w:type="dxa"/>
-              <w:bottom w:w="80" w:type="dxa"/>
-              <w:right w:w="120" w:type="dxa"/>
-            </w:tcMar>
           </w:tcPr>
           <w:p>
             <w:pPr>
@@ -4017,12 +3857,6 @@
               <w:right w:val="single" w:sz="4" w:space="0" w:color="C8D0DC"/>
             </w:tcBorders>
             <w:shd w:val="clear" w:color="auto" w:fill="FFFFFF"/>
-            <w:tcMar>
-              <w:top w:w="80" w:type="dxa"/>
-              <w:left w:w="120" w:type="dxa"/>
-              <w:bottom w:w="80" w:type="dxa"/>
-              <w:right w:w="120" w:type="dxa"/>
-            </w:tcMar>
           </w:tcPr>
           <w:p>
             <w:pPr>
@@ -4046,12 +3880,6 @@
               <w:right w:val="single" w:sz="4" w:space="0" w:color="C8D0DC"/>
             </w:tcBorders>
             <w:shd w:val="clear" w:color="auto" w:fill="FFFFFF"/>
-            <w:tcMar>
-              <w:top w:w="80" w:type="dxa"/>
-              <w:left w:w="120" w:type="dxa"/>
-              <w:bottom w:w="80" w:type="dxa"/>
-              <w:right w:w="120" w:type="dxa"/>
-            </w:tcMar>
           </w:tcPr>
           <w:p>
             <w:pPr>
@@ -4075,12 +3903,6 @@
               <w:right w:val="single" w:sz="4" w:space="0" w:color="C8D0DC"/>
             </w:tcBorders>
             <w:shd w:val="clear" w:color="auto" w:fill="FFFFFF"/>
-            <w:tcMar>
-              <w:top w:w="80" w:type="dxa"/>
-              <w:left w:w="120" w:type="dxa"/>
-              <w:bottom w:w="80" w:type="dxa"/>
-              <w:right w:w="120" w:type="dxa"/>
-            </w:tcMar>
           </w:tcPr>
           <w:p>
             <w:pPr>
@@ -4106,12 +3928,6 @@
               <w:right w:val="single" w:sz="4" w:space="0" w:color="C8D0DC"/>
             </w:tcBorders>
             <w:shd w:val="clear" w:color="auto" w:fill="F2F2F2"/>
-            <w:tcMar>
-              <w:top w:w="80" w:type="dxa"/>
-              <w:left w:w="120" w:type="dxa"/>
-              <w:bottom w:w="80" w:type="dxa"/>
-              <w:right w:w="120" w:type="dxa"/>
-            </w:tcMar>
           </w:tcPr>
           <w:p>
             <w:pPr>
@@ -4135,12 +3951,6 @@
               <w:right w:val="single" w:sz="4" w:space="0" w:color="C8D0DC"/>
             </w:tcBorders>
             <w:shd w:val="clear" w:color="auto" w:fill="F2F2F2"/>
-            <w:tcMar>
-              <w:top w:w="80" w:type="dxa"/>
-              <w:left w:w="120" w:type="dxa"/>
-              <w:bottom w:w="80" w:type="dxa"/>
-              <w:right w:w="120" w:type="dxa"/>
-            </w:tcMar>
           </w:tcPr>
           <w:p>
             <w:pPr>
@@ -4164,12 +3974,6 @@
               <w:right w:val="single" w:sz="4" w:space="0" w:color="C8D0DC"/>
             </w:tcBorders>
             <w:shd w:val="clear" w:color="auto" w:fill="F2F2F2"/>
-            <w:tcMar>
-              <w:top w:w="80" w:type="dxa"/>
-              <w:left w:w="120" w:type="dxa"/>
-              <w:bottom w:w="80" w:type="dxa"/>
-              <w:right w:w="120" w:type="dxa"/>
-            </w:tcMar>
           </w:tcPr>
           <w:p>
             <w:pPr>
@@ -4195,12 +3999,6 @@
               <w:right w:val="single" w:sz="4" w:space="0" w:color="C8D0DC"/>
             </w:tcBorders>
             <w:shd w:val="clear" w:color="auto" w:fill="FFFFFF"/>
-            <w:tcMar>
-              <w:top w:w="80" w:type="dxa"/>
-              <w:left w:w="120" w:type="dxa"/>
-              <w:bottom w:w="80" w:type="dxa"/>
-              <w:right w:w="120" w:type="dxa"/>
-            </w:tcMar>
           </w:tcPr>
           <w:p>
             <w:pPr>
@@ -4224,12 +4022,6 @@
               <w:right w:val="single" w:sz="4" w:space="0" w:color="C8D0DC"/>
             </w:tcBorders>
             <w:shd w:val="clear" w:color="auto" w:fill="FFFFFF"/>
-            <w:tcMar>
-              <w:top w:w="80" w:type="dxa"/>
-              <w:left w:w="120" w:type="dxa"/>
-              <w:bottom w:w="80" w:type="dxa"/>
-              <w:right w:w="120" w:type="dxa"/>
-            </w:tcMar>
           </w:tcPr>
           <w:p>
             <w:pPr>
@@ -4253,12 +4045,6 @@
               <w:right w:val="single" w:sz="4" w:space="0" w:color="C8D0DC"/>
             </w:tcBorders>
             <w:shd w:val="clear" w:color="auto" w:fill="FFFFFF"/>
-            <w:tcMar>
-              <w:top w:w="80" w:type="dxa"/>
-              <w:left w:w="120" w:type="dxa"/>
-              <w:bottom w:w="80" w:type="dxa"/>
-              <w:right w:w="120" w:type="dxa"/>
-            </w:tcMar>
           </w:tcPr>
           <w:p>
             <w:pPr>
@@ -4372,7 +4158,7 @@
         <w:pStyle w:val="Heading2"/>
       </w:pPr>
       <w:bookmarkStart w:id="16" w:name="Xde52b6885aeff57b147d7451abbc6886e45847a"/>
-      <w:bookmarkStart w:id="17" w:name="_Toc233786871"/>
+      <w:bookmarkStart w:id="17" w:name="_Toc233815404"/>
       <w:bookmarkEnd w:id="14"/>
       <w:r>
         <w:t>3.3 What the .com Exception Means Structurally</w:t>
@@ -4400,7 +4186,7 @@
         <w:pStyle w:val="Heading2"/>
       </w:pPr>
       <w:bookmarkStart w:id="18" w:name="the-call-path-from-citizen-to-agent"/>
-      <w:bookmarkStart w:id="19" w:name="_Toc233786872"/>
+      <w:bookmarkStart w:id="19" w:name="_Toc233815405"/>
       <w:bookmarkEnd w:id="16"/>
       <w:r>
         <w:t>3.4 The Call Path: From Citizen to Agent</w:t>
@@ -4480,7 +4266,7 @@
         <w:pStyle w:val="Heading2"/>
       </w:pPr>
       <w:bookmarkStart w:id="20" w:name="the-mpls-hairpin-applied-to-the-n8nn"/>
-      <w:bookmarkStart w:id="21" w:name="_Toc233786873"/>
+      <w:bookmarkStart w:id="21" w:name="_Toc233815406"/>
       <w:bookmarkEnd w:id="18"/>
       <w:r>
         <w:t>3.5 The MPLS Hairpin Applied to the N8NN</w:t>
@@ -4496,7 +4282,7 @@
           <w:noProof/>
         </w:rPr>
         <w:drawing>
-          <wp:inline distT="0" distB="0" distL="0" distR="0" wp14:anchorId="64F1A0F3" wp14:editId="24B877AD">
+          <wp:inline distT="0" distB="0" distL="0" distR="0" wp14:anchorId="711EB00C" wp14:editId="4154A688">
             <wp:extent cx="5334000" cy="2933700"/>
             <wp:effectExtent l="0" t="0" r="0" b="0"/>
             <wp:docPr id="31" name="Picture" descr="MPLS Hairpin vs. Local Breakout: Before and After"/>
@@ -4621,7 +4407,7 @@
           <w:noProof/>
         </w:rPr>
         <w:drawing>
-          <wp:inline distT="0" distB="0" distL="0" distR="0" wp14:anchorId="53D3E2D1" wp14:editId="02B143E5">
+          <wp:inline distT="0" distB="0" distL="0" distR="0" wp14:anchorId="67859814" wp14:editId="0B282DF5">
             <wp:extent cx="5334000" cy="2726266"/>
             <wp:effectExtent l="0" t="0" r="0" b="0"/>
             <wp:docPr id="34" name="Picture" descr="WebRTC Voice Path: DSCP EF from Agent Desktop to Amazon Connect"/>
@@ -4676,7 +4462,7 @@
         <w:pStyle w:val="Heading2"/>
       </w:pPr>
       <w:bookmarkStart w:id="22" w:name="webrtc-network-requirements"/>
-      <w:bookmarkStart w:id="23" w:name="_Toc233786874"/>
+      <w:bookmarkStart w:id="23" w:name="_Toc233815407"/>
       <w:bookmarkEnd w:id="20"/>
       <w:r>
         <w:t>3.6 WebRTC Network Requirements</w:t>
@@ -4686,17 +4472,18 @@
     <w:tbl>
       <w:tblPr>
         <w:tblStyle w:val="Table"/>
-        <w:tblW w:w="9360" w:type="dxa"/>
+        <w:tblW w:w="5000" w:type="pct"/>
         <w:tblLayout w:type="fixed"/>
-        <w:tblLook w:val="0600" w:firstRow="0" w:lastRow="0" w:firstColumn="0" w:lastColumn="0" w:noHBand="1" w:noVBand="1"/>
+        <w:tblLook w:val="0020" w:firstRow="1" w:lastRow="0" w:firstColumn="0" w:lastColumn="0" w:noHBand="0" w:noVBand="0"/>
       </w:tblPr>
       <w:tblGrid>
-        <w:gridCol w:w="3322"/>
-        <w:gridCol w:w="3925"/>
-        <w:gridCol w:w="2113"/>
+        <w:gridCol w:w="3398"/>
+        <w:gridCol w:w="4016"/>
+        <w:gridCol w:w="2162"/>
       </w:tblGrid>
       <w:tr>
         <w:trPr>
+          <w:cnfStyle w:val="100000000000" w:firstRow="1" w:lastRow="0" w:firstColumn="0" w:lastColumn="0" w:oddVBand="0" w:evenVBand="0" w:oddHBand="0" w:evenHBand="0" w:firstRowFirstColumn="0" w:firstRowLastColumn="0" w:lastRowFirstColumn="0" w:lastRowLastColumn="0"/>
           <w:tblHeader/>
         </w:trPr>
         <w:tc>
@@ -4709,12 +4496,6 @@
               <w:right w:val="single" w:sz="4" w:space="0" w:color="C8D0DC"/>
             </w:tcBorders>
             <w:shd w:val="clear" w:color="auto" w:fill="1F3864"/>
-            <w:tcMar>
-              <w:top w:w="80" w:type="dxa"/>
-              <w:left w:w="120" w:type="dxa"/>
-              <w:bottom w:w="80" w:type="dxa"/>
-              <w:right w:w="120" w:type="dxa"/>
-            </w:tcMar>
           </w:tcPr>
           <w:p>
             <w:pPr>
@@ -4740,12 +4521,6 @@
               <w:right w:val="single" w:sz="4" w:space="0" w:color="C8D0DC"/>
             </w:tcBorders>
             <w:shd w:val="clear" w:color="auto" w:fill="1F3864"/>
-            <w:tcMar>
-              <w:top w:w="80" w:type="dxa"/>
-              <w:left w:w="120" w:type="dxa"/>
-              <w:bottom w:w="80" w:type="dxa"/>
-              <w:right w:w="120" w:type="dxa"/>
-            </w:tcMar>
           </w:tcPr>
           <w:p>
             <w:pPr>
@@ -4771,12 +4546,6 @@
               <w:right w:val="single" w:sz="4" w:space="0" w:color="C8D0DC"/>
             </w:tcBorders>
             <w:shd w:val="clear" w:color="auto" w:fill="1F3864"/>
-            <w:tcMar>
-              <w:top w:w="80" w:type="dxa"/>
-              <w:left w:w="120" w:type="dxa"/>
-              <w:bottom w:w="80" w:type="dxa"/>
-              <w:right w:w="120" w:type="dxa"/>
-            </w:tcMar>
           </w:tcPr>
           <w:p>
             <w:pPr>
@@ -4804,12 +4573,6 @@
               <w:right w:val="single" w:sz="4" w:space="0" w:color="C8D0DC"/>
             </w:tcBorders>
             <w:shd w:val="clear" w:color="auto" w:fill="FFFFFF"/>
-            <w:tcMar>
-              <w:top w:w="80" w:type="dxa"/>
-              <w:left w:w="120" w:type="dxa"/>
-              <w:bottom w:w="80" w:type="dxa"/>
-              <w:right w:w="120" w:type="dxa"/>
-            </w:tcMar>
           </w:tcPr>
           <w:p>
             <w:pPr>
@@ -4833,12 +4596,6 @@
               <w:right w:val="single" w:sz="4" w:space="0" w:color="C8D0DC"/>
             </w:tcBorders>
             <w:shd w:val="clear" w:color="auto" w:fill="FFFFFF"/>
-            <w:tcMar>
-              <w:top w:w="80" w:type="dxa"/>
-              <w:left w:w="120" w:type="dxa"/>
-              <w:bottom w:w="80" w:type="dxa"/>
-              <w:right w:w="120" w:type="dxa"/>
-            </w:tcMar>
           </w:tcPr>
           <w:p>
             <w:pPr>
@@ -4862,12 +4619,6 @@
               <w:right w:val="single" w:sz="4" w:space="0" w:color="C8D0DC"/>
             </w:tcBorders>
             <w:shd w:val="clear" w:color="auto" w:fill="FFFFFF"/>
-            <w:tcMar>
-              <w:top w:w="80" w:type="dxa"/>
-              <w:left w:w="120" w:type="dxa"/>
-              <w:bottom w:w="80" w:type="dxa"/>
-              <w:right w:w="120" w:type="dxa"/>
-            </w:tcMar>
           </w:tcPr>
           <w:p>
             <w:pPr>
@@ -4893,12 +4644,6 @@
               <w:right w:val="single" w:sz="4" w:space="0" w:color="C8D0DC"/>
             </w:tcBorders>
             <w:shd w:val="clear" w:color="auto" w:fill="F2F2F2"/>
-            <w:tcMar>
-              <w:top w:w="80" w:type="dxa"/>
-              <w:left w:w="120" w:type="dxa"/>
-              <w:bottom w:w="80" w:type="dxa"/>
-              <w:right w:w="120" w:type="dxa"/>
-            </w:tcMar>
           </w:tcPr>
           <w:p>
             <w:pPr>
@@ -4922,12 +4667,6 @@
               <w:right w:val="single" w:sz="4" w:space="0" w:color="C8D0DC"/>
             </w:tcBorders>
             <w:shd w:val="clear" w:color="auto" w:fill="F2F2F2"/>
-            <w:tcMar>
-              <w:top w:w="80" w:type="dxa"/>
-              <w:left w:w="120" w:type="dxa"/>
-              <w:bottom w:w="80" w:type="dxa"/>
-              <w:right w:w="120" w:type="dxa"/>
-            </w:tcMar>
           </w:tcPr>
           <w:p>
             <w:pPr>
@@ -4951,12 +4690,6 @@
               <w:right w:val="single" w:sz="4" w:space="0" w:color="C8D0DC"/>
             </w:tcBorders>
             <w:shd w:val="clear" w:color="auto" w:fill="F2F2F2"/>
-            <w:tcMar>
-              <w:top w:w="80" w:type="dxa"/>
-              <w:left w:w="120" w:type="dxa"/>
-              <w:bottom w:w="80" w:type="dxa"/>
-              <w:right w:w="120" w:type="dxa"/>
-            </w:tcMar>
           </w:tcPr>
           <w:p>
             <w:pPr>
@@ -4982,12 +4715,6 @@
               <w:right w:val="single" w:sz="4" w:space="0" w:color="C8D0DC"/>
             </w:tcBorders>
             <w:shd w:val="clear" w:color="auto" w:fill="FFFFFF"/>
-            <w:tcMar>
-              <w:top w:w="80" w:type="dxa"/>
-              <w:left w:w="120" w:type="dxa"/>
-              <w:bottom w:w="80" w:type="dxa"/>
-              <w:right w:w="120" w:type="dxa"/>
-            </w:tcMar>
           </w:tcPr>
           <w:p>
             <w:pPr>
@@ -5011,12 +4738,6 @@
               <w:right w:val="single" w:sz="4" w:space="0" w:color="C8D0DC"/>
             </w:tcBorders>
             <w:shd w:val="clear" w:color="auto" w:fill="FFFFFF"/>
-            <w:tcMar>
-              <w:top w:w="80" w:type="dxa"/>
-              <w:left w:w="120" w:type="dxa"/>
-              <w:bottom w:w="80" w:type="dxa"/>
-              <w:right w:w="120" w:type="dxa"/>
-            </w:tcMar>
           </w:tcPr>
           <w:p>
             <w:pPr>
@@ -5040,12 +4761,6 @@
               <w:right w:val="single" w:sz="4" w:space="0" w:color="C8D0DC"/>
             </w:tcBorders>
             <w:shd w:val="clear" w:color="auto" w:fill="FFFFFF"/>
-            <w:tcMar>
-              <w:top w:w="80" w:type="dxa"/>
-              <w:left w:w="120" w:type="dxa"/>
-              <w:bottom w:w="80" w:type="dxa"/>
-              <w:right w:w="120" w:type="dxa"/>
-            </w:tcMar>
           </w:tcPr>
           <w:p>
             <w:pPr>
@@ -5071,12 +4786,6 @@
               <w:right w:val="single" w:sz="4" w:space="0" w:color="C8D0DC"/>
             </w:tcBorders>
             <w:shd w:val="clear" w:color="auto" w:fill="F2F2F2"/>
-            <w:tcMar>
-              <w:top w:w="80" w:type="dxa"/>
-              <w:left w:w="120" w:type="dxa"/>
-              <w:bottom w:w="80" w:type="dxa"/>
-              <w:right w:w="120" w:type="dxa"/>
-            </w:tcMar>
           </w:tcPr>
           <w:p>
             <w:pPr>
@@ -5100,12 +4809,6 @@
               <w:right w:val="single" w:sz="4" w:space="0" w:color="C8D0DC"/>
             </w:tcBorders>
             <w:shd w:val="clear" w:color="auto" w:fill="F2F2F2"/>
-            <w:tcMar>
-              <w:top w:w="80" w:type="dxa"/>
-              <w:left w:w="120" w:type="dxa"/>
-              <w:bottom w:w="80" w:type="dxa"/>
-              <w:right w:w="120" w:type="dxa"/>
-            </w:tcMar>
           </w:tcPr>
           <w:p>
             <w:pPr>
@@ -5129,12 +4832,6 @@
               <w:right w:val="single" w:sz="4" w:space="0" w:color="C8D0DC"/>
             </w:tcBorders>
             <w:shd w:val="clear" w:color="auto" w:fill="F2F2F2"/>
-            <w:tcMar>
-              <w:top w:w="80" w:type="dxa"/>
-              <w:left w:w="120" w:type="dxa"/>
-              <w:bottom w:w="80" w:type="dxa"/>
-              <w:right w:w="120" w:type="dxa"/>
-            </w:tcMar>
           </w:tcPr>
           <w:p>
             <w:pPr>
@@ -5160,12 +4857,6 @@
               <w:right w:val="single" w:sz="4" w:space="0" w:color="C8D0DC"/>
             </w:tcBorders>
             <w:shd w:val="clear" w:color="auto" w:fill="FFFFFF"/>
-            <w:tcMar>
-              <w:top w:w="80" w:type="dxa"/>
-              <w:left w:w="120" w:type="dxa"/>
-              <w:bottom w:w="80" w:type="dxa"/>
-              <w:right w:w="120" w:type="dxa"/>
-            </w:tcMar>
           </w:tcPr>
           <w:p>
             <w:pPr>
@@ -5189,12 +4880,6 @@
               <w:right w:val="single" w:sz="4" w:space="0" w:color="C8D0DC"/>
             </w:tcBorders>
             <w:shd w:val="clear" w:color="auto" w:fill="FFFFFF"/>
-            <w:tcMar>
-              <w:top w:w="80" w:type="dxa"/>
-              <w:left w:w="120" w:type="dxa"/>
-              <w:bottom w:w="80" w:type="dxa"/>
-              <w:right w:w="120" w:type="dxa"/>
-            </w:tcMar>
           </w:tcPr>
           <w:p>
             <w:pPr>
@@ -5218,12 +4903,6 @@
               <w:right w:val="single" w:sz="4" w:space="0" w:color="C8D0DC"/>
             </w:tcBorders>
             <w:shd w:val="clear" w:color="auto" w:fill="FFFFFF"/>
-            <w:tcMar>
-              <w:top w:w="80" w:type="dxa"/>
-              <w:left w:w="120" w:type="dxa"/>
-              <w:bottom w:w="80" w:type="dxa"/>
-              <w:right w:w="120" w:type="dxa"/>
-            </w:tcMar>
           </w:tcPr>
           <w:p>
             <w:pPr>
@@ -5249,12 +4928,6 @@
               <w:right w:val="single" w:sz="4" w:space="0" w:color="C8D0DC"/>
             </w:tcBorders>
             <w:shd w:val="clear" w:color="auto" w:fill="F2F2F2"/>
-            <w:tcMar>
-              <w:top w:w="80" w:type="dxa"/>
-              <w:left w:w="120" w:type="dxa"/>
-              <w:bottom w:w="80" w:type="dxa"/>
-              <w:right w:w="120" w:type="dxa"/>
-            </w:tcMar>
           </w:tcPr>
           <w:p>
             <w:pPr>
@@ -5278,12 +4951,6 @@
               <w:right w:val="single" w:sz="4" w:space="0" w:color="C8D0DC"/>
             </w:tcBorders>
             <w:shd w:val="clear" w:color="auto" w:fill="F2F2F2"/>
-            <w:tcMar>
-              <w:top w:w="80" w:type="dxa"/>
-              <w:left w:w="120" w:type="dxa"/>
-              <w:bottom w:w="80" w:type="dxa"/>
-              <w:right w:w="120" w:type="dxa"/>
-            </w:tcMar>
           </w:tcPr>
           <w:p>
             <w:pPr>
@@ -5307,12 +4974,6 @@
               <w:right w:val="single" w:sz="4" w:space="0" w:color="C8D0DC"/>
             </w:tcBorders>
             <w:shd w:val="clear" w:color="auto" w:fill="F2F2F2"/>
-            <w:tcMar>
-              <w:top w:w="80" w:type="dxa"/>
-              <w:left w:w="120" w:type="dxa"/>
-              <w:bottom w:w="80" w:type="dxa"/>
-              <w:right w:w="120" w:type="dxa"/>
-            </w:tcMar>
           </w:tcPr>
           <w:p>
             <w:pPr>
@@ -5338,12 +4999,6 @@
               <w:right w:val="single" w:sz="4" w:space="0" w:color="C8D0DC"/>
             </w:tcBorders>
             <w:shd w:val="clear" w:color="auto" w:fill="FFFFFF"/>
-            <w:tcMar>
-              <w:top w:w="80" w:type="dxa"/>
-              <w:left w:w="120" w:type="dxa"/>
-              <w:bottom w:w="80" w:type="dxa"/>
-              <w:right w:w="120" w:type="dxa"/>
-            </w:tcMar>
           </w:tcPr>
           <w:p>
             <w:pPr>
@@ -5367,12 +5022,6 @@
               <w:right w:val="single" w:sz="4" w:space="0" w:color="C8D0DC"/>
             </w:tcBorders>
             <w:shd w:val="clear" w:color="auto" w:fill="FFFFFF"/>
-            <w:tcMar>
-              <w:top w:w="80" w:type="dxa"/>
-              <w:left w:w="120" w:type="dxa"/>
-              <w:bottom w:w="80" w:type="dxa"/>
-              <w:right w:w="120" w:type="dxa"/>
-            </w:tcMar>
           </w:tcPr>
           <w:p>
             <w:pPr>
@@ -5396,12 +5045,6 @@
               <w:right w:val="single" w:sz="4" w:space="0" w:color="C8D0DC"/>
             </w:tcBorders>
             <w:shd w:val="clear" w:color="auto" w:fill="FFFFFF"/>
-            <w:tcMar>
-              <w:top w:w="80" w:type="dxa"/>
-              <w:left w:w="120" w:type="dxa"/>
-              <w:bottom w:w="80" w:type="dxa"/>
-              <w:right w:w="120" w:type="dxa"/>
-            </w:tcMar>
           </w:tcPr>
           <w:p>
             <w:pPr>
@@ -5427,12 +5070,6 @@
               <w:right w:val="single" w:sz="4" w:space="0" w:color="C8D0DC"/>
             </w:tcBorders>
             <w:shd w:val="clear" w:color="auto" w:fill="F2F2F2"/>
-            <w:tcMar>
-              <w:top w:w="80" w:type="dxa"/>
-              <w:left w:w="120" w:type="dxa"/>
-              <w:bottom w:w="80" w:type="dxa"/>
-              <w:right w:w="120" w:type="dxa"/>
-            </w:tcMar>
           </w:tcPr>
           <w:p>
             <w:pPr>
@@ -5456,12 +5093,6 @@
               <w:right w:val="single" w:sz="4" w:space="0" w:color="C8D0DC"/>
             </w:tcBorders>
             <w:shd w:val="clear" w:color="auto" w:fill="F2F2F2"/>
-            <w:tcMar>
-              <w:top w:w="80" w:type="dxa"/>
-              <w:left w:w="120" w:type="dxa"/>
-              <w:bottom w:w="80" w:type="dxa"/>
-              <w:right w:w="120" w:type="dxa"/>
-            </w:tcMar>
           </w:tcPr>
           <w:p>
             <w:pPr>
@@ -5485,12 +5116,6 @@
               <w:right w:val="single" w:sz="4" w:space="0" w:color="C8D0DC"/>
             </w:tcBorders>
             <w:shd w:val="clear" w:color="auto" w:fill="F2F2F2"/>
-            <w:tcMar>
-              <w:top w:w="80" w:type="dxa"/>
-              <w:left w:w="120" w:type="dxa"/>
-              <w:bottom w:w="80" w:type="dxa"/>
-              <w:right w:w="120" w:type="dxa"/>
-            </w:tcMar>
           </w:tcPr>
           <w:p>
             <w:pPr>
@@ -5511,7 +5136,7 @@
         <w:pStyle w:val="Heading2"/>
       </w:pPr>
       <w:bookmarkStart w:id="24" w:name="Xbed96861338ac2e20a810f098fa52474470f4ce"/>
-      <w:bookmarkStart w:id="25" w:name="_Toc233786875"/>
+      <w:bookmarkStart w:id="25" w:name="_Toc233815408"/>
       <w:bookmarkEnd w:id="22"/>
       <w:r>
         <w:t>3.7 Asymmetric Routing: The Session Killer Latency Does Not Explain</w:t>
@@ -5527,7 +5152,7 @@
           <w:noProof/>
         </w:rPr>
         <w:drawing>
-          <wp:inline distT="0" distB="0" distL="0" distR="0" wp14:anchorId="6586651B" wp14:editId="6FE1B07F">
+          <wp:inline distT="0" distB="0" distL="0" distR="0" wp14:anchorId="1F77B8B1" wp14:editId="4EF529FA">
             <wp:extent cx="5334000" cy="2844800"/>
             <wp:effectExtent l="0" t="0" r="0" b="0"/>
             <wp:docPr id="39" name="Picture" descr="Asymmetric Routing: The Session Killer That Looks Like Configuration Error"/>
@@ -5641,7 +5266,7 @@
         <w:pStyle w:val="Heading1"/>
       </w:pPr>
       <w:bookmarkStart w:id="26" w:name="X839c1c655003bd3897e8b5851a50b9508e76f4d"/>
-      <w:bookmarkStart w:id="27" w:name="_Toc233786876"/>
+      <w:bookmarkStart w:id="27" w:name="_Toc233815409"/>
       <w:bookmarkEnd w:id="10"/>
       <w:bookmarkEnd w:id="24"/>
       <w:r>
@@ -5654,7 +5279,7 @@
         <w:pStyle w:val="Heading2"/>
       </w:pPr>
       <w:bookmarkStart w:id="28" w:name="what-teams-phone-is"/>
-      <w:bookmarkStart w:id="29" w:name="_Toc233786877"/>
+      <w:bookmarkStart w:id="29" w:name="_Toc233815410"/>
       <w:r>
         <w:t>4.1 What Teams Phone Is</w:t>
       </w:r>
@@ -5688,7 +5313,7 @@
         <w:pStyle w:val="Heading2"/>
       </w:pPr>
       <w:bookmarkStart w:id="30" w:name="X6ece0fcf0855462989a3ddd91807ca0d93f5e19"/>
-      <w:bookmarkStart w:id="31" w:name="_Toc233786878"/>
+      <w:bookmarkStart w:id="31" w:name="_Toc233815411"/>
       <w:bookmarkEnd w:id="28"/>
       <w:r>
         <w:t>4.2 PSTN Connectivity: Direct Routing and the SBC</w:t>
@@ -5789,7 +5414,7 @@
         <w:pStyle w:val="Heading2"/>
       </w:pPr>
       <w:bookmarkStart w:id="32" w:name="e911-federal-legal-requirements"/>
-      <w:bookmarkStart w:id="33" w:name="_Toc233786879"/>
+      <w:bookmarkStart w:id="33" w:name="_Toc233815412"/>
       <w:bookmarkEnd w:id="30"/>
       <w:r>
         <w:t>4.3 E911: Federal Legal Requirements</w:t>
@@ -5805,7 +5430,7 @@
           <w:noProof/>
         </w:rPr>
         <w:drawing>
-          <wp:inline distT="0" distB="0" distL="0" distR="0" wp14:anchorId="403CFA5D" wp14:editId="7E5D8FEF">
+          <wp:inline distT="0" distB="0" distL="0" distR="0" wp14:anchorId="2E584732" wp14:editId="0BB007CF">
             <wp:extent cx="5334000" cy="2755900"/>
             <wp:effectExtent l="0" t="0" r="0" b="0"/>
             <wp:docPr id="46" name="Picture" descr="E911 Compliance and Teams Phone GCC Boundary"/>
@@ -5926,7 +5551,7 @@
           <w:noProof/>
         </w:rPr>
         <w:drawing>
-          <wp:inline distT="0" distB="0" distL="0" distR="0" wp14:anchorId="6667AEF8" wp14:editId="32B056B5">
+          <wp:inline distT="0" distB="0" distL="0" distR="0" wp14:anchorId="7B283DFA" wp14:editId="51DE9F59">
             <wp:extent cx="5334000" cy="2726266"/>
             <wp:effectExtent l="0" t="0" r="0" b="0"/>
             <wp:docPr id="49" name="Picture" descr="Legacy PBX to Teams Phone GCC: Platform Modernization"/>
@@ -5981,7 +5606,7 @@
         <w:pStyle w:val="Heading2"/>
       </w:pPr>
       <w:bookmarkStart w:id="34" w:name="Xc6d6f0f9ab976088fca5f667c98e6f2686f49b2"/>
-      <w:bookmarkStart w:id="35" w:name="_Toc233786880"/>
+      <w:bookmarkStart w:id="35" w:name="_Toc233815413"/>
       <w:bookmarkEnd w:id="32"/>
       <w:r>
         <w:t>4.4 Legacy PBX Migration: Number Porting and Transition</w:t>
@@ -6056,7 +5681,7 @@
         <w:pStyle w:val="Heading1"/>
       </w:pPr>
       <w:bookmarkStart w:id="36" w:name="one-investment-two-platforms"/>
-      <w:bookmarkStart w:id="37" w:name="_Toc233786881"/>
+      <w:bookmarkStart w:id="37" w:name="_Toc233815414"/>
       <w:bookmarkEnd w:id="26"/>
       <w:bookmarkEnd w:id="34"/>
       <w:r>
@@ -6069,7 +5694,7 @@
         <w:pStyle w:val="Heading2"/>
       </w:pPr>
       <w:bookmarkStart w:id="38" w:name="the-architecture-both-platforms-require"/>
-      <w:bookmarkStart w:id="39" w:name="_Toc233786882"/>
+      <w:bookmarkStart w:id="39" w:name="_Toc233815415"/>
       <w:r>
         <w:t>5.1 The Architecture Both Platforms Require</w:t>
       </w:r>
@@ -6084,7 +5709,7 @@
           <w:noProof/>
         </w:rPr>
         <w:drawing>
-          <wp:inline distT="0" distB="0" distL="0" distR="0" wp14:anchorId="31FB25D6" wp14:editId="0AE7528B">
+          <wp:inline distT="0" distB="0" distL="0" distR="0" wp14:anchorId="6493F92A" wp14:editId="1BCAA650">
             <wp:extent cx="5334000" cy="3022600"/>
             <wp:effectExtent l="0" t="0" r="0" b="0"/>
             <wp:docPr id="55" name="Picture" descr="One SD-WAN Investment: Two Voice Platforms"/>
@@ -6150,7 +5775,7 @@
         <w:pStyle w:val="Heading2"/>
       </w:pPr>
       <w:bookmarkStart w:id="40" w:name="X119a6ef9ab3643d048ae2abef2403893680628b"/>
-      <w:bookmarkStart w:id="41" w:name="_Toc233786883"/>
+      <w:bookmarkStart w:id="41" w:name="_Toc233815416"/>
       <w:bookmarkEnd w:id="38"/>
       <w:r>
         <w:t>5.2 The Hybrid Agent: Two Simultaneous DSCP EF Streams</w:t>
@@ -6166,7 +5791,7 @@
           <w:noProof/>
         </w:rPr>
         <w:drawing>
-          <wp:inline distT="0" distB="0" distL="0" distR="0" wp14:anchorId="67566321" wp14:editId="7825D183">
+          <wp:inline distT="0" distB="0" distL="0" distR="0" wp14:anchorId="485B0DAC" wp14:editId="68286BAE">
             <wp:extent cx="5334000" cy="2755900"/>
             <wp:effectExtent l="0" t="0" r="0" b="0"/>
             <wp:docPr id="59" name="Picture" descr="Hybrid Agent: Dual Concurrent Voice Streams"/>
@@ -6249,7 +5874,7 @@
         <w:pStyle w:val="Heading3"/>
       </w:pPr>
       <w:bookmarkStart w:id="42" w:name="headset-and-browser-configuration"/>
-      <w:bookmarkStart w:id="43" w:name="_Toc233786884"/>
+      <w:bookmarkStart w:id="43" w:name="_Toc233815417"/>
       <w:r>
         <w:t>5.2.1 Headset and Browser Configuration</w:t>
       </w:r>
@@ -6293,7 +5918,7 @@
         <w:pStyle w:val="Heading2"/>
       </w:pPr>
       <w:bookmarkStart w:id="44" w:name="Xd43b70dd148dff0e4376593b87afb1af30bd473"/>
-      <w:bookmarkStart w:id="45" w:name="_Toc233786885"/>
+      <w:bookmarkStart w:id="45" w:name="_Toc233815418"/>
       <w:bookmarkEnd w:id="40"/>
       <w:bookmarkEnd w:id="42"/>
       <w:r>
@@ -6371,7 +5996,7 @@
         <w:pStyle w:val="Heading1"/>
       </w:pPr>
       <w:bookmarkStart w:id="46" w:name="X50c43ddecf199ebf91917431a313350dc266772"/>
-      <w:bookmarkStart w:id="47" w:name="_Toc233786886"/>
+      <w:bookmarkStart w:id="47" w:name="_Toc233815419"/>
       <w:bookmarkEnd w:id="36"/>
       <w:bookmarkEnd w:id="44"/>
       <w:r>
@@ -6388,7 +6013,7 @@
           <w:noProof/>
         </w:rPr>
         <w:drawing>
-          <wp:inline distT="0" distB="0" distL="0" distR="0" wp14:anchorId="5DE37757" wp14:editId="7A661C0B">
+          <wp:inline distT="0" distB="0" distL="0" distR="0" wp14:anchorId="71B7D723" wp14:editId="34C54D41">
             <wp:extent cx="5334000" cy="2933700"/>
             <wp:effectExtent l="0" t="0" r="0" b="0"/>
             <wp:docPr id="66" name="Picture" descr="DIA Enables — SASE Achieves: NIST Control Stack"/>
@@ -6449,17 +6074,18 @@
     <w:tbl>
       <w:tblPr>
         <w:tblStyle w:val="Table"/>
-        <w:tblW w:w="9360" w:type="dxa"/>
+        <w:tblW w:w="5000" w:type="pct"/>
         <w:tblLayout w:type="fixed"/>
-        <w:tblLook w:val="0600" w:firstRow="0" w:lastRow="0" w:firstColumn="0" w:lastColumn="0" w:noHBand="1" w:noVBand="1"/>
+        <w:tblLook w:val="0020" w:firstRow="1" w:lastRow="0" w:firstColumn="0" w:lastColumn="0" w:noHBand="0" w:noVBand="0"/>
       </w:tblPr>
       <w:tblGrid>
-        <w:gridCol w:w="3120"/>
-        <w:gridCol w:w="3120"/>
-        <w:gridCol w:w="3120"/>
+        <w:gridCol w:w="3192"/>
+        <w:gridCol w:w="3192"/>
+        <w:gridCol w:w="3192"/>
       </w:tblGrid>
       <w:tr>
         <w:trPr>
+          <w:cnfStyle w:val="100000000000" w:firstRow="1" w:lastRow="0" w:firstColumn="0" w:lastColumn="0" w:oddVBand="0" w:evenVBand="0" w:oddHBand="0" w:evenHBand="0" w:firstRowFirstColumn="0" w:firstRowLastColumn="0" w:lastRowFirstColumn="0" w:lastRowLastColumn="0"/>
           <w:tblHeader/>
         </w:trPr>
         <w:tc>
@@ -6472,12 +6098,6 @@
               <w:right w:val="single" w:sz="4" w:space="0" w:color="C8D0DC"/>
             </w:tcBorders>
             <w:shd w:val="clear" w:color="auto" w:fill="1F3864"/>
-            <w:tcMar>
-              <w:top w:w="80" w:type="dxa"/>
-              <w:left w:w="120" w:type="dxa"/>
-              <w:bottom w:w="80" w:type="dxa"/>
-              <w:right w:w="120" w:type="dxa"/>
-            </w:tcMar>
           </w:tcPr>
           <w:p>
             <w:pPr>
@@ -6503,12 +6123,6 @@
               <w:right w:val="single" w:sz="4" w:space="0" w:color="C8D0DC"/>
             </w:tcBorders>
             <w:shd w:val="clear" w:color="auto" w:fill="1F3864"/>
-            <w:tcMar>
-              <w:top w:w="80" w:type="dxa"/>
-              <w:left w:w="120" w:type="dxa"/>
-              <w:bottom w:w="80" w:type="dxa"/>
-              <w:right w:w="120" w:type="dxa"/>
-            </w:tcMar>
           </w:tcPr>
           <w:p>
             <w:pPr>
@@ -6534,12 +6148,6 @@
               <w:right w:val="single" w:sz="4" w:space="0" w:color="C8D0DC"/>
             </w:tcBorders>
             <w:shd w:val="clear" w:color="auto" w:fill="1F3864"/>
-            <w:tcMar>
-              <w:top w:w="80" w:type="dxa"/>
-              <w:left w:w="120" w:type="dxa"/>
-              <w:bottom w:w="80" w:type="dxa"/>
-              <w:right w:w="120" w:type="dxa"/>
-            </w:tcMar>
           </w:tcPr>
           <w:p>
             <w:pPr>
@@ -6567,12 +6175,6 @@
               <w:right w:val="single" w:sz="4" w:space="0" w:color="C8D0DC"/>
             </w:tcBorders>
             <w:shd w:val="clear" w:color="auto" w:fill="FFFFFF"/>
-            <w:tcMar>
-              <w:top w:w="80" w:type="dxa"/>
-              <w:left w:w="120" w:type="dxa"/>
-              <w:bottom w:w="80" w:type="dxa"/>
-              <w:right w:w="120" w:type="dxa"/>
-            </w:tcMar>
           </w:tcPr>
           <w:p>
             <w:pPr>
@@ -6596,12 +6198,6 @@
               <w:right w:val="single" w:sz="4" w:space="0" w:color="C8D0DC"/>
             </w:tcBorders>
             <w:shd w:val="clear" w:color="auto" w:fill="FFFFFF"/>
-            <w:tcMar>
-              <w:top w:w="80" w:type="dxa"/>
-              <w:left w:w="120" w:type="dxa"/>
-              <w:bottom w:w="80" w:type="dxa"/>
-              <w:right w:w="120" w:type="dxa"/>
-            </w:tcMar>
           </w:tcPr>
           <w:p>
             <w:pPr>
@@ -6625,12 +6221,6 @@
               <w:right w:val="single" w:sz="4" w:space="0" w:color="C8D0DC"/>
             </w:tcBorders>
             <w:shd w:val="clear" w:color="auto" w:fill="FFFFFF"/>
-            <w:tcMar>
-              <w:top w:w="80" w:type="dxa"/>
-              <w:left w:w="120" w:type="dxa"/>
-              <w:bottom w:w="80" w:type="dxa"/>
-              <w:right w:w="120" w:type="dxa"/>
-            </w:tcMar>
           </w:tcPr>
           <w:p>
             <w:pPr>
@@ -6656,12 +6246,6 @@
               <w:right w:val="single" w:sz="4" w:space="0" w:color="C8D0DC"/>
             </w:tcBorders>
             <w:shd w:val="clear" w:color="auto" w:fill="F2F2F2"/>
-            <w:tcMar>
-              <w:top w:w="80" w:type="dxa"/>
-              <w:left w:w="120" w:type="dxa"/>
-              <w:bottom w:w="80" w:type="dxa"/>
-              <w:right w:w="120" w:type="dxa"/>
-            </w:tcMar>
           </w:tcPr>
           <w:p>
             <w:pPr>
@@ -6685,12 +6269,6 @@
               <w:right w:val="single" w:sz="4" w:space="0" w:color="C8D0DC"/>
             </w:tcBorders>
             <w:shd w:val="clear" w:color="auto" w:fill="F2F2F2"/>
-            <w:tcMar>
-              <w:top w:w="80" w:type="dxa"/>
-              <w:left w:w="120" w:type="dxa"/>
-              <w:bottom w:w="80" w:type="dxa"/>
-              <w:right w:w="120" w:type="dxa"/>
-            </w:tcMar>
           </w:tcPr>
           <w:p>
             <w:pPr>
@@ -6714,12 +6292,6 @@
               <w:right w:val="single" w:sz="4" w:space="0" w:color="C8D0DC"/>
             </w:tcBorders>
             <w:shd w:val="clear" w:color="auto" w:fill="F2F2F2"/>
-            <w:tcMar>
-              <w:top w:w="80" w:type="dxa"/>
-              <w:left w:w="120" w:type="dxa"/>
-              <w:bottom w:w="80" w:type="dxa"/>
-              <w:right w:w="120" w:type="dxa"/>
-            </w:tcMar>
           </w:tcPr>
           <w:p>
             <w:pPr>
@@ -6745,12 +6317,6 @@
               <w:right w:val="single" w:sz="4" w:space="0" w:color="C8D0DC"/>
             </w:tcBorders>
             <w:shd w:val="clear" w:color="auto" w:fill="FFFFFF"/>
-            <w:tcMar>
-              <w:top w:w="80" w:type="dxa"/>
-              <w:left w:w="120" w:type="dxa"/>
-              <w:bottom w:w="80" w:type="dxa"/>
-              <w:right w:w="120" w:type="dxa"/>
-            </w:tcMar>
           </w:tcPr>
           <w:p>
             <w:pPr>
@@ -6774,12 +6340,6 @@
               <w:right w:val="single" w:sz="4" w:space="0" w:color="C8D0DC"/>
             </w:tcBorders>
             <w:shd w:val="clear" w:color="auto" w:fill="FFFFFF"/>
-            <w:tcMar>
-              <w:top w:w="80" w:type="dxa"/>
-              <w:left w:w="120" w:type="dxa"/>
-              <w:bottom w:w="80" w:type="dxa"/>
-              <w:right w:w="120" w:type="dxa"/>
-            </w:tcMar>
           </w:tcPr>
           <w:p>
             <w:pPr>
@@ -6803,12 +6363,6 @@
               <w:right w:val="single" w:sz="4" w:space="0" w:color="C8D0DC"/>
             </w:tcBorders>
             <w:shd w:val="clear" w:color="auto" w:fill="FFFFFF"/>
-            <w:tcMar>
-              <w:top w:w="80" w:type="dxa"/>
-              <w:left w:w="120" w:type="dxa"/>
-              <w:bottom w:w="80" w:type="dxa"/>
-              <w:right w:w="120" w:type="dxa"/>
-            </w:tcMar>
           </w:tcPr>
           <w:p>
             <w:pPr>
@@ -6834,12 +6388,6 @@
               <w:right w:val="single" w:sz="4" w:space="0" w:color="C8D0DC"/>
             </w:tcBorders>
             <w:shd w:val="clear" w:color="auto" w:fill="F2F2F2"/>
-            <w:tcMar>
-              <w:top w:w="80" w:type="dxa"/>
-              <w:left w:w="120" w:type="dxa"/>
-              <w:bottom w:w="80" w:type="dxa"/>
-              <w:right w:w="120" w:type="dxa"/>
-            </w:tcMar>
           </w:tcPr>
           <w:p>
             <w:pPr>
@@ -6863,12 +6411,6 @@
               <w:right w:val="single" w:sz="4" w:space="0" w:color="C8D0DC"/>
             </w:tcBorders>
             <w:shd w:val="clear" w:color="auto" w:fill="F2F2F2"/>
-            <w:tcMar>
-              <w:top w:w="80" w:type="dxa"/>
-              <w:left w:w="120" w:type="dxa"/>
-              <w:bottom w:w="80" w:type="dxa"/>
-              <w:right w:w="120" w:type="dxa"/>
-            </w:tcMar>
           </w:tcPr>
           <w:p>
             <w:pPr>
@@ -6892,12 +6434,6 @@
               <w:right w:val="single" w:sz="4" w:space="0" w:color="C8D0DC"/>
             </w:tcBorders>
             <w:shd w:val="clear" w:color="auto" w:fill="F2F2F2"/>
-            <w:tcMar>
-              <w:top w:w="80" w:type="dxa"/>
-              <w:left w:w="120" w:type="dxa"/>
-              <w:bottom w:w="80" w:type="dxa"/>
-              <w:right w:w="120" w:type="dxa"/>
-            </w:tcMar>
           </w:tcPr>
           <w:p>
             <w:pPr>
@@ -6923,12 +6459,6 @@
               <w:right w:val="single" w:sz="4" w:space="0" w:color="C8D0DC"/>
             </w:tcBorders>
             <w:shd w:val="clear" w:color="auto" w:fill="FFFFFF"/>
-            <w:tcMar>
-              <w:top w:w="80" w:type="dxa"/>
-              <w:left w:w="120" w:type="dxa"/>
-              <w:bottom w:w="80" w:type="dxa"/>
-              <w:right w:w="120" w:type="dxa"/>
-            </w:tcMar>
           </w:tcPr>
           <w:p>
             <w:pPr>
@@ -6952,12 +6482,6 @@
               <w:right w:val="single" w:sz="4" w:space="0" w:color="C8D0DC"/>
             </w:tcBorders>
             <w:shd w:val="clear" w:color="auto" w:fill="FFFFFF"/>
-            <w:tcMar>
-              <w:top w:w="80" w:type="dxa"/>
-              <w:left w:w="120" w:type="dxa"/>
-              <w:bottom w:w="80" w:type="dxa"/>
-              <w:right w:w="120" w:type="dxa"/>
-            </w:tcMar>
           </w:tcPr>
           <w:p>
             <w:pPr>
@@ -6981,12 +6505,6 @@
               <w:right w:val="single" w:sz="4" w:space="0" w:color="C8D0DC"/>
             </w:tcBorders>
             <w:shd w:val="clear" w:color="auto" w:fill="FFFFFF"/>
-            <w:tcMar>
-              <w:top w:w="80" w:type="dxa"/>
-              <w:left w:w="120" w:type="dxa"/>
-              <w:bottom w:w="80" w:type="dxa"/>
-              <w:right w:w="120" w:type="dxa"/>
-            </w:tcMar>
           </w:tcPr>
           <w:p>
             <w:pPr>
@@ -7012,12 +6530,6 @@
               <w:right w:val="single" w:sz="4" w:space="0" w:color="C8D0DC"/>
             </w:tcBorders>
             <w:shd w:val="clear" w:color="auto" w:fill="F2F2F2"/>
-            <w:tcMar>
-              <w:top w:w="80" w:type="dxa"/>
-              <w:left w:w="120" w:type="dxa"/>
-              <w:bottom w:w="80" w:type="dxa"/>
-              <w:right w:w="120" w:type="dxa"/>
-            </w:tcMar>
           </w:tcPr>
           <w:p>
             <w:pPr>
@@ -7041,12 +6553,6 @@
               <w:right w:val="single" w:sz="4" w:space="0" w:color="C8D0DC"/>
             </w:tcBorders>
             <w:shd w:val="clear" w:color="auto" w:fill="F2F2F2"/>
-            <w:tcMar>
-              <w:top w:w="80" w:type="dxa"/>
-              <w:left w:w="120" w:type="dxa"/>
-              <w:bottom w:w="80" w:type="dxa"/>
-              <w:right w:w="120" w:type="dxa"/>
-            </w:tcMar>
           </w:tcPr>
           <w:p>
             <w:pPr>
@@ -7070,12 +6576,6 @@
               <w:right w:val="single" w:sz="4" w:space="0" w:color="C8D0DC"/>
             </w:tcBorders>
             <w:shd w:val="clear" w:color="auto" w:fill="F2F2F2"/>
-            <w:tcMar>
-              <w:top w:w="80" w:type="dxa"/>
-              <w:left w:w="120" w:type="dxa"/>
-              <w:bottom w:w="80" w:type="dxa"/>
-              <w:right w:w="120" w:type="dxa"/>
-            </w:tcMar>
           </w:tcPr>
           <w:p>
             <w:pPr>
@@ -7101,12 +6601,6 @@
               <w:right w:val="single" w:sz="4" w:space="0" w:color="C8D0DC"/>
             </w:tcBorders>
             <w:shd w:val="clear" w:color="auto" w:fill="FFFFFF"/>
-            <w:tcMar>
-              <w:top w:w="80" w:type="dxa"/>
-              <w:left w:w="120" w:type="dxa"/>
-              <w:bottom w:w="80" w:type="dxa"/>
-              <w:right w:w="120" w:type="dxa"/>
-            </w:tcMar>
           </w:tcPr>
           <w:p>
             <w:pPr>
@@ -7130,12 +6624,6 @@
               <w:right w:val="single" w:sz="4" w:space="0" w:color="C8D0DC"/>
             </w:tcBorders>
             <w:shd w:val="clear" w:color="auto" w:fill="FFFFFF"/>
-            <w:tcMar>
-              <w:top w:w="80" w:type="dxa"/>
-              <w:left w:w="120" w:type="dxa"/>
-              <w:bottom w:w="80" w:type="dxa"/>
-              <w:right w:w="120" w:type="dxa"/>
-            </w:tcMar>
           </w:tcPr>
           <w:p>
             <w:pPr>
@@ -7159,12 +6647,6 @@
               <w:right w:val="single" w:sz="4" w:space="0" w:color="C8D0DC"/>
             </w:tcBorders>
             <w:shd w:val="clear" w:color="auto" w:fill="FFFFFF"/>
-            <w:tcMar>
-              <w:top w:w="80" w:type="dxa"/>
-              <w:left w:w="120" w:type="dxa"/>
-              <w:bottom w:w="80" w:type="dxa"/>
-              <w:right w:w="120" w:type="dxa"/>
-            </w:tcMar>
           </w:tcPr>
           <w:p>
             <w:pPr>
@@ -7203,7 +6685,7 @@
         <w:pStyle w:val="Heading1"/>
       </w:pPr>
       <w:bookmarkStart w:id="48" w:name="Xdff915852ecfb7099a0dce077831b9d7635e7fa"/>
-      <w:bookmarkStart w:id="49" w:name="_Toc233786887"/>
+      <w:bookmarkStart w:id="49" w:name="_Toc233815420"/>
       <w:bookmarkEnd w:id="46"/>
       <w:r>
         <w:t>7. FedRAMP Boundary Considerations for Telecommunications</w:t>
@@ -7219,7 +6701,7 @@
           <w:noProof/>
         </w:rPr>
         <w:drawing>
-          <wp:inline distT="0" distB="0" distL="0" distR="0" wp14:anchorId="3A4ED13A" wp14:editId="7CBD6207">
+          <wp:inline distT="0" distB="0" distL="0" distR="0" wp14:anchorId="1031940D" wp14:editId="59097D9B">
             <wp:extent cx="5334000" cy="2726266"/>
             <wp:effectExtent l="0" t="0" r="0" b="0"/>
             <wp:docPr id="70" name="Picture" descr="FedRAMP 20x Consolidated Rules: Telecommunications Implications"/>
@@ -7274,7 +6756,7 @@
         <w:pStyle w:val="Heading2"/>
       </w:pPr>
       <w:bookmarkStart w:id="50" w:name="sec-fedramp-20x-telecom"/>
-      <w:bookmarkStart w:id="51" w:name="_Toc233786888"/>
+      <w:bookmarkStart w:id="51" w:name="_Toc233815421"/>
       <w:r>
         <w:t>7.1 FedRAMP 20x Consolidated Rules — June 2026 Update</w:t>
       </w:r>
@@ -7313,17 +6795,18 @@
     <w:tbl>
       <w:tblPr>
         <w:tblStyle w:val="Table"/>
-        <w:tblW w:w="9360" w:type="dxa"/>
+        <w:tblW w:w="5000" w:type="pct"/>
         <w:tblLayout w:type="fixed"/>
-        <w:tblLook w:val="0600" w:firstRow="0" w:lastRow="0" w:firstColumn="0" w:lastColumn="0" w:noHBand="1" w:noVBand="1"/>
+        <w:tblLook w:val="0020" w:firstRow="1" w:lastRow="0" w:firstColumn="0" w:lastColumn="0" w:noHBand="0" w:noVBand="0"/>
       </w:tblPr>
       <w:tblGrid>
-        <w:gridCol w:w="1276"/>
-        <w:gridCol w:w="1489"/>
-        <w:gridCol w:w="6595"/>
+        <w:gridCol w:w="1306"/>
+        <w:gridCol w:w="1523"/>
+        <w:gridCol w:w="6747"/>
       </w:tblGrid>
       <w:tr>
         <w:trPr>
+          <w:cnfStyle w:val="100000000000" w:firstRow="1" w:lastRow="0" w:firstColumn="0" w:lastColumn="0" w:oddVBand="0" w:evenVBand="0" w:oddHBand="0" w:evenHBand="0" w:firstRowFirstColumn="0" w:firstRowLastColumn="0" w:lastRowFirstColumn="0" w:lastRowLastColumn="0"/>
           <w:tblHeader/>
         </w:trPr>
         <w:tc>
@@ -7336,12 +6819,6 @@
               <w:right w:val="single" w:sz="4" w:space="0" w:color="C8D0DC"/>
             </w:tcBorders>
             <w:shd w:val="clear" w:color="auto" w:fill="1F3864"/>
-            <w:tcMar>
-              <w:top w:w="80" w:type="dxa"/>
-              <w:left w:w="120" w:type="dxa"/>
-              <w:bottom w:w="80" w:type="dxa"/>
-              <w:right w:w="120" w:type="dxa"/>
-            </w:tcMar>
           </w:tcPr>
           <w:p>
             <w:pPr>
@@ -7367,12 +6844,6 @@
               <w:right w:val="single" w:sz="4" w:space="0" w:color="C8D0DC"/>
             </w:tcBorders>
             <w:shd w:val="clear" w:color="auto" w:fill="1F3864"/>
-            <w:tcMar>
-              <w:top w:w="80" w:type="dxa"/>
-              <w:left w:w="120" w:type="dxa"/>
-              <w:bottom w:w="80" w:type="dxa"/>
-              <w:right w:w="120" w:type="dxa"/>
-            </w:tcMar>
           </w:tcPr>
           <w:p>
             <w:pPr>
@@ -7398,12 +6869,6 @@
               <w:right w:val="single" w:sz="4" w:space="0" w:color="C8D0DC"/>
             </w:tcBorders>
             <w:shd w:val="clear" w:color="auto" w:fill="1F3864"/>
-            <w:tcMar>
-              <w:top w:w="80" w:type="dxa"/>
-              <w:left w:w="120" w:type="dxa"/>
-              <w:bottom w:w="80" w:type="dxa"/>
-              <w:right w:w="120" w:type="dxa"/>
-            </w:tcMar>
           </w:tcPr>
           <w:p>
             <w:pPr>
@@ -7431,12 +6896,6 @@
               <w:right w:val="single" w:sz="4" w:space="0" w:color="C8D0DC"/>
             </w:tcBorders>
             <w:shd w:val="clear" w:color="auto" w:fill="FFFFFF"/>
-            <w:tcMar>
-              <w:top w:w="80" w:type="dxa"/>
-              <w:left w:w="120" w:type="dxa"/>
-              <w:bottom w:w="80" w:type="dxa"/>
-              <w:right w:w="120" w:type="dxa"/>
-            </w:tcMar>
           </w:tcPr>
           <w:p>
             <w:pPr>
@@ -7460,12 +6919,6 @@
               <w:right w:val="single" w:sz="4" w:space="0" w:color="C8D0DC"/>
             </w:tcBorders>
             <w:shd w:val="clear" w:color="auto" w:fill="FFFFFF"/>
-            <w:tcMar>
-              <w:top w:w="80" w:type="dxa"/>
-              <w:left w:w="120" w:type="dxa"/>
-              <w:bottom w:w="80" w:type="dxa"/>
-              <w:right w:w="120" w:type="dxa"/>
-            </w:tcMar>
           </w:tcPr>
           <w:p>
             <w:pPr>
@@ -7489,12 +6942,6 @@
               <w:right w:val="single" w:sz="4" w:space="0" w:color="C8D0DC"/>
             </w:tcBorders>
             <w:shd w:val="clear" w:color="auto" w:fill="FFFFFF"/>
-            <w:tcMar>
-              <w:top w:w="80" w:type="dxa"/>
-              <w:left w:w="120" w:type="dxa"/>
-              <w:bottom w:w="80" w:type="dxa"/>
-              <w:right w:w="120" w:type="dxa"/>
-            </w:tcMar>
           </w:tcPr>
           <w:p>
             <w:pPr>
@@ -7520,12 +6967,6 @@
               <w:right w:val="single" w:sz="4" w:space="0" w:color="C8D0DC"/>
             </w:tcBorders>
             <w:shd w:val="clear" w:color="auto" w:fill="F2F2F2"/>
-            <w:tcMar>
-              <w:top w:w="80" w:type="dxa"/>
-              <w:left w:w="120" w:type="dxa"/>
-              <w:bottom w:w="80" w:type="dxa"/>
-              <w:right w:w="120" w:type="dxa"/>
-            </w:tcMar>
           </w:tcPr>
           <w:p>
             <w:pPr>
@@ -7549,12 +6990,6 @@
               <w:right w:val="single" w:sz="4" w:space="0" w:color="C8D0DC"/>
             </w:tcBorders>
             <w:shd w:val="clear" w:color="auto" w:fill="F2F2F2"/>
-            <w:tcMar>
-              <w:top w:w="80" w:type="dxa"/>
-              <w:left w:w="120" w:type="dxa"/>
-              <w:bottom w:w="80" w:type="dxa"/>
-              <w:right w:w="120" w:type="dxa"/>
-            </w:tcMar>
           </w:tcPr>
           <w:p>
             <w:pPr>
@@ -7578,12 +7013,6 @@
               <w:right w:val="single" w:sz="4" w:space="0" w:color="C8D0DC"/>
             </w:tcBorders>
             <w:shd w:val="clear" w:color="auto" w:fill="F2F2F2"/>
-            <w:tcMar>
-              <w:top w:w="80" w:type="dxa"/>
-              <w:left w:w="120" w:type="dxa"/>
-              <w:bottom w:w="80" w:type="dxa"/>
-              <w:right w:w="120" w:type="dxa"/>
-            </w:tcMar>
           </w:tcPr>
           <w:p>
             <w:pPr>
@@ -7609,12 +7038,6 @@
               <w:right w:val="single" w:sz="4" w:space="0" w:color="C8D0DC"/>
             </w:tcBorders>
             <w:shd w:val="clear" w:color="auto" w:fill="FFFFFF"/>
-            <w:tcMar>
-              <w:top w:w="80" w:type="dxa"/>
-              <w:left w:w="120" w:type="dxa"/>
-              <w:bottom w:w="80" w:type="dxa"/>
-              <w:right w:w="120" w:type="dxa"/>
-            </w:tcMar>
           </w:tcPr>
           <w:p>
             <w:pPr>
@@ -7638,12 +7061,6 @@
               <w:right w:val="single" w:sz="4" w:space="0" w:color="C8D0DC"/>
             </w:tcBorders>
             <w:shd w:val="clear" w:color="auto" w:fill="FFFFFF"/>
-            <w:tcMar>
-              <w:top w:w="80" w:type="dxa"/>
-              <w:left w:w="120" w:type="dxa"/>
-              <w:bottom w:w="80" w:type="dxa"/>
-              <w:right w:w="120" w:type="dxa"/>
-            </w:tcMar>
           </w:tcPr>
           <w:p>
             <w:pPr>
@@ -7667,12 +7084,6 @@
               <w:right w:val="single" w:sz="4" w:space="0" w:color="C8D0DC"/>
             </w:tcBorders>
             <w:shd w:val="clear" w:color="auto" w:fill="FFFFFF"/>
-            <w:tcMar>
-              <w:top w:w="80" w:type="dxa"/>
-              <w:left w:w="120" w:type="dxa"/>
-              <w:bottom w:w="80" w:type="dxa"/>
-              <w:right w:w="120" w:type="dxa"/>
-            </w:tcMar>
           </w:tcPr>
           <w:p>
             <w:pPr>
@@ -7698,12 +7109,6 @@
               <w:right w:val="single" w:sz="4" w:space="0" w:color="C8D0DC"/>
             </w:tcBorders>
             <w:shd w:val="clear" w:color="auto" w:fill="F2F2F2"/>
-            <w:tcMar>
-              <w:top w:w="80" w:type="dxa"/>
-              <w:left w:w="120" w:type="dxa"/>
-              <w:bottom w:w="80" w:type="dxa"/>
-              <w:right w:w="120" w:type="dxa"/>
-            </w:tcMar>
           </w:tcPr>
           <w:p>
             <w:pPr>
@@ -7727,12 +7132,6 @@
               <w:right w:val="single" w:sz="4" w:space="0" w:color="C8D0DC"/>
             </w:tcBorders>
             <w:shd w:val="clear" w:color="auto" w:fill="F2F2F2"/>
-            <w:tcMar>
-              <w:top w:w="80" w:type="dxa"/>
-              <w:left w:w="120" w:type="dxa"/>
-              <w:bottom w:w="80" w:type="dxa"/>
-              <w:right w:w="120" w:type="dxa"/>
-            </w:tcMar>
           </w:tcPr>
           <w:p>
             <w:pPr>
@@ -7756,12 +7155,6 @@
               <w:right w:val="single" w:sz="4" w:space="0" w:color="C8D0DC"/>
             </w:tcBorders>
             <w:shd w:val="clear" w:color="auto" w:fill="F2F2F2"/>
-            <w:tcMar>
-              <w:top w:w="80" w:type="dxa"/>
-              <w:left w:w="120" w:type="dxa"/>
-              <w:bottom w:w="80" w:type="dxa"/>
-              <w:right w:w="120" w:type="dxa"/>
-            </w:tcMar>
           </w:tcPr>
           <w:p>
             <w:pPr>
@@ -7787,12 +7180,6 @@
               <w:right w:val="single" w:sz="4" w:space="0" w:color="C8D0DC"/>
             </w:tcBorders>
             <w:shd w:val="clear" w:color="auto" w:fill="FFFFFF"/>
-            <w:tcMar>
-              <w:top w:w="80" w:type="dxa"/>
-              <w:left w:w="120" w:type="dxa"/>
-              <w:bottom w:w="80" w:type="dxa"/>
-              <w:right w:w="120" w:type="dxa"/>
-            </w:tcMar>
           </w:tcPr>
           <w:p>
             <w:pPr>
@@ -7816,12 +7203,6 @@
               <w:right w:val="single" w:sz="4" w:space="0" w:color="C8D0DC"/>
             </w:tcBorders>
             <w:shd w:val="clear" w:color="auto" w:fill="FFFFFF"/>
-            <w:tcMar>
-              <w:top w:w="80" w:type="dxa"/>
-              <w:left w:w="120" w:type="dxa"/>
-              <w:bottom w:w="80" w:type="dxa"/>
-              <w:right w:w="120" w:type="dxa"/>
-            </w:tcMar>
           </w:tcPr>
           <w:p>
             <w:pPr>
@@ -7845,12 +7226,6 @@
               <w:right w:val="single" w:sz="4" w:space="0" w:color="C8D0DC"/>
             </w:tcBorders>
             <w:shd w:val="clear" w:color="auto" w:fill="FFFFFF"/>
-            <w:tcMar>
-              <w:top w:w="80" w:type="dxa"/>
-              <w:left w:w="120" w:type="dxa"/>
-              <w:bottom w:w="80" w:type="dxa"/>
-              <w:right w:w="120" w:type="dxa"/>
-            </w:tcMar>
           </w:tcPr>
           <w:p>
             <w:pPr>
@@ -7988,7 +7363,7 @@
     <w:tbl>
       <w:tblPr>
         <w:tblStyle w:val="Table"/>
-        <w:tblW w:w="9360" w:type="dxa"/>
+        <w:tblW w:w="0" w:type="auto"/>
         <w:tblBorders>
           <w:top w:val="single" w:sz="4" w:space="0" w:color="00A047"/>
           <w:left w:val="single" w:sz="24" w:space="0" w:color="00A047"/>
@@ -7999,10 +7374,10 @@
           <w:left w:w="144" w:type="dxa"/>
           <w:right w:w="144" w:type="dxa"/>
         </w:tblCellMar>
-        <w:tblLook w:val="0600" w:firstRow="0" w:lastRow="0" w:firstColumn="0" w:lastColumn="0" w:noHBand="1" w:noVBand="1"/>
+        <w:tblLook w:val="0000" w:firstRow="0" w:lastRow="0" w:firstColumn="0" w:lastColumn="0" w:noHBand="0" w:noVBand="0"/>
       </w:tblPr>
       <w:tblGrid>
-        <w:gridCol w:w="9360"/>
+        <w:gridCol w:w="9648"/>
       </w:tblGrid>
       <w:tr>
         <w:trPr>
@@ -8019,10 +7394,8 @@
             </w:tcBorders>
             <w:shd w:val="clear" w:color="auto" w:fill="1F3864"/>
             <w:tcMar>
-              <w:top w:w="80" w:type="dxa"/>
-              <w:left w:w="120" w:type="dxa"/>
-              <w:bottom w:w="80" w:type="dxa"/>
-              <w:right w:w="120" w:type="dxa"/>
+              <w:top w:w="92" w:type="dxa"/>
+              <w:bottom w:w="92" w:type="dxa"/>
             </w:tcMar>
           </w:tcPr>
           <w:p>
@@ -8039,7 +7412,7 @@
                 <w:sz w:val="20"/>
               </w:rPr>
               <w:drawing>
-                <wp:inline distT="0" distB="0" distL="0" distR="0" wp14:anchorId="08669D15" wp14:editId="63A4EFE4">
+                <wp:inline distT="0" distB="0" distL="0" distR="0" wp14:anchorId="5C2476B4" wp14:editId="7DEAB798">
                   <wp:extent cx="152400" cy="152400"/>
                   <wp:effectExtent l="0" t="0" r="0" b="0"/>
                   <wp:docPr id="73" name="Picture"/>
@@ -8106,10 +7479,8 @@
             </w:tcBorders>
             <w:shd w:val="clear" w:color="auto" w:fill="FFFFFF"/>
             <w:tcMar>
-              <w:top w:w="80" w:type="dxa"/>
-              <w:left w:w="120" w:type="dxa"/>
-              <w:bottom w:w="80" w:type="dxa"/>
-              <w:right w:w="120" w:type="dxa"/>
+              <w:top w:w="108" w:type="dxa"/>
+              <w:bottom w:w="108" w:type="dxa"/>
             </w:tcMar>
           </w:tcPr>
           <w:p>
@@ -8161,7 +7532,7 @@
         <w:pStyle w:val="Heading2"/>
       </w:pPr>
       <w:bookmarkStart w:id="52" w:name="X7409e10531376a3c99a5e9f5e98c45fb0a0a3d0"/>
-      <w:bookmarkStart w:id="53" w:name="_Toc233786889"/>
+      <w:bookmarkStart w:id="53" w:name="_Toc233815422"/>
       <w:bookmarkEnd w:id="50"/>
       <w:r>
         <w:t>7.2 Amazon Connect: .com Boundary Documentation Requirements</w:t>
@@ -8282,7 +7653,7 @@
         <w:pStyle w:val="Heading2"/>
       </w:pPr>
       <w:bookmarkStart w:id="54" w:name="teams-phone-gcc-boundary-and-pstn"/>
-      <w:bookmarkStart w:id="55" w:name="_Toc233786890"/>
+      <w:bookmarkStart w:id="55" w:name="_Toc233815423"/>
       <w:bookmarkEnd w:id="52"/>
       <w:r>
         <w:t>7.3 Teams Phone: GCC Boundary and PSTN</w:t>
@@ -8302,7 +7673,7 @@
         <w:pStyle w:val="Heading2"/>
       </w:pPr>
       <w:bookmarkStart w:id="56" w:name="X6519cabc81b3848456687843ce47cf45a8be6c7"/>
-      <w:bookmarkStart w:id="57" w:name="_Toc233786891"/>
+      <w:bookmarkStart w:id="57" w:name="_Toc233815424"/>
       <w:bookmarkEnd w:id="54"/>
       <w:r>
         <w:t>7.4 Amazon Connect vs. Teams Phone: Complementary, Not Competing</w:t>
@@ -8312,17 +7683,18 @@
     <w:tbl>
       <w:tblPr>
         <w:tblStyle w:val="Table"/>
-        <w:tblW w:w="9360" w:type="dxa"/>
+        <w:tblW w:w="5000" w:type="pct"/>
         <w:tblLayout w:type="fixed"/>
-        <w:tblLook w:val="0600" w:firstRow="0" w:lastRow="0" w:firstColumn="0" w:lastColumn="0" w:noHBand="1" w:noVBand="1"/>
+        <w:tblLook w:val="0020" w:firstRow="1" w:lastRow="0" w:firstColumn="0" w:lastColumn="0" w:noHBand="0" w:noVBand="0"/>
       </w:tblPr>
       <w:tblGrid>
-        <w:gridCol w:w="1184"/>
-        <w:gridCol w:w="4088"/>
-        <w:gridCol w:w="4088"/>
+        <w:gridCol w:w="1210"/>
+        <w:gridCol w:w="4183"/>
+        <w:gridCol w:w="4183"/>
       </w:tblGrid>
       <w:tr>
         <w:trPr>
+          <w:cnfStyle w:val="100000000000" w:firstRow="1" w:lastRow="0" w:firstColumn="0" w:lastColumn="0" w:oddVBand="0" w:evenVBand="0" w:oddHBand="0" w:evenHBand="0" w:firstRowFirstColumn="0" w:firstRowLastColumn="0" w:lastRowFirstColumn="0" w:lastRowLastColumn="0"/>
           <w:tblHeader/>
         </w:trPr>
         <w:tc>
@@ -8335,12 +7707,6 @@
               <w:right w:val="single" w:sz="4" w:space="0" w:color="C8D0DC"/>
             </w:tcBorders>
             <w:shd w:val="clear" w:color="auto" w:fill="1F3864"/>
-            <w:tcMar>
-              <w:top w:w="80" w:type="dxa"/>
-              <w:left w:w="120" w:type="dxa"/>
-              <w:bottom w:w="80" w:type="dxa"/>
-              <w:right w:w="120" w:type="dxa"/>
-            </w:tcMar>
           </w:tcPr>
           <w:p>
             <w:pPr>
@@ -8366,12 +7732,6 @@
               <w:right w:val="single" w:sz="4" w:space="0" w:color="C8D0DC"/>
             </w:tcBorders>
             <w:shd w:val="clear" w:color="auto" w:fill="1F3864"/>
-            <w:tcMar>
-              <w:top w:w="80" w:type="dxa"/>
-              <w:left w:w="120" w:type="dxa"/>
-              <w:bottom w:w="80" w:type="dxa"/>
-              <w:right w:w="120" w:type="dxa"/>
-            </w:tcMar>
           </w:tcPr>
           <w:p>
             <w:pPr>
@@ -8397,12 +7757,6 @@
               <w:right w:val="single" w:sz="4" w:space="0" w:color="C8D0DC"/>
             </w:tcBorders>
             <w:shd w:val="clear" w:color="auto" w:fill="1F3864"/>
-            <w:tcMar>
-              <w:top w:w="80" w:type="dxa"/>
-              <w:left w:w="120" w:type="dxa"/>
-              <w:bottom w:w="80" w:type="dxa"/>
-              <w:right w:w="120" w:type="dxa"/>
-            </w:tcMar>
           </w:tcPr>
           <w:p>
             <w:pPr>
@@ -8430,12 +7784,6 @@
               <w:right w:val="single" w:sz="4" w:space="0" w:color="C8D0DC"/>
             </w:tcBorders>
             <w:shd w:val="clear" w:color="auto" w:fill="FFFFFF"/>
-            <w:tcMar>
-              <w:top w:w="80" w:type="dxa"/>
-              <w:left w:w="120" w:type="dxa"/>
-              <w:bottom w:w="80" w:type="dxa"/>
-              <w:right w:w="120" w:type="dxa"/>
-            </w:tcMar>
           </w:tcPr>
           <w:p>
             <w:pPr>
@@ -8459,12 +7807,6 @@
               <w:right w:val="single" w:sz="4" w:space="0" w:color="C8D0DC"/>
             </w:tcBorders>
             <w:shd w:val="clear" w:color="auto" w:fill="FFFFFF"/>
-            <w:tcMar>
-              <w:top w:w="80" w:type="dxa"/>
-              <w:left w:w="120" w:type="dxa"/>
-              <w:bottom w:w="80" w:type="dxa"/>
-              <w:right w:w="120" w:type="dxa"/>
-            </w:tcMar>
           </w:tcPr>
           <w:p>
             <w:pPr>
@@ -8488,12 +7830,6 @@
               <w:right w:val="single" w:sz="4" w:space="0" w:color="C8D0DC"/>
             </w:tcBorders>
             <w:shd w:val="clear" w:color="auto" w:fill="FFFFFF"/>
-            <w:tcMar>
-              <w:top w:w="80" w:type="dxa"/>
-              <w:left w:w="120" w:type="dxa"/>
-              <w:bottom w:w="80" w:type="dxa"/>
-              <w:right w:w="120" w:type="dxa"/>
-            </w:tcMar>
           </w:tcPr>
           <w:p>
             <w:pPr>
@@ -8519,12 +7855,6 @@
               <w:right w:val="single" w:sz="4" w:space="0" w:color="C8D0DC"/>
             </w:tcBorders>
             <w:shd w:val="clear" w:color="auto" w:fill="F2F2F2"/>
-            <w:tcMar>
-              <w:top w:w="80" w:type="dxa"/>
-              <w:left w:w="120" w:type="dxa"/>
-              <w:bottom w:w="80" w:type="dxa"/>
-              <w:right w:w="120" w:type="dxa"/>
-            </w:tcMar>
           </w:tcPr>
           <w:p>
             <w:pPr>
@@ -8548,12 +7878,6 @@
               <w:right w:val="single" w:sz="4" w:space="0" w:color="C8D0DC"/>
             </w:tcBorders>
             <w:shd w:val="clear" w:color="auto" w:fill="F2F2F2"/>
-            <w:tcMar>
-              <w:top w:w="80" w:type="dxa"/>
-              <w:left w:w="120" w:type="dxa"/>
-              <w:bottom w:w="80" w:type="dxa"/>
-              <w:right w:w="120" w:type="dxa"/>
-            </w:tcMar>
           </w:tcPr>
           <w:p>
             <w:pPr>
@@ -8577,12 +7901,6 @@
               <w:right w:val="single" w:sz="4" w:space="0" w:color="C8D0DC"/>
             </w:tcBorders>
             <w:shd w:val="clear" w:color="auto" w:fill="F2F2F2"/>
-            <w:tcMar>
-              <w:top w:w="80" w:type="dxa"/>
-              <w:left w:w="120" w:type="dxa"/>
-              <w:bottom w:w="80" w:type="dxa"/>
-              <w:right w:w="120" w:type="dxa"/>
-            </w:tcMar>
           </w:tcPr>
           <w:p>
             <w:pPr>
@@ -8608,12 +7926,6 @@
               <w:right w:val="single" w:sz="4" w:space="0" w:color="C8D0DC"/>
             </w:tcBorders>
             <w:shd w:val="clear" w:color="auto" w:fill="FFFFFF"/>
-            <w:tcMar>
-              <w:top w:w="80" w:type="dxa"/>
-              <w:left w:w="120" w:type="dxa"/>
-              <w:bottom w:w="80" w:type="dxa"/>
-              <w:right w:w="120" w:type="dxa"/>
-            </w:tcMar>
           </w:tcPr>
           <w:p>
             <w:pPr>
@@ -8637,12 +7949,6 @@
               <w:right w:val="single" w:sz="4" w:space="0" w:color="C8D0DC"/>
             </w:tcBorders>
             <w:shd w:val="clear" w:color="auto" w:fill="FFFFFF"/>
-            <w:tcMar>
-              <w:top w:w="80" w:type="dxa"/>
-              <w:left w:w="120" w:type="dxa"/>
-              <w:bottom w:w="80" w:type="dxa"/>
-              <w:right w:w="120" w:type="dxa"/>
-            </w:tcMar>
           </w:tcPr>
           <w:p>
             <w:pPr>
@@ -8666,12 +7972,6 @@
               <w:right w:val="single" w:sz="4" w:space="0" w:color="C8D0DC"/>
             </w:tcBorders>
             <w:shd w:val="clear" w:color="auto" w:fill="FFFFFF"/>
-            <w:tcMar>
-              <w:top w:w="80" w:type="dxa"/>
-              <w:left w:w="120" w:type="dxa"/>
-              <w:bottom w:w="80" w:type="dxa"/>
-              <w:right w:w="120" w:type="dxa"/>
-            </w:tcMar>
           </w:tcPr>
           <w:p>
             <w:pPr>
@@ -8697,12 +7997,6 @@
               <w:right w:val="single" w:sz="4" w:space="0" w:color="C8D0DC"/>
             </w:tcBorders>
             <w:shd w:val="clear" w:color="auto" w:fill="F2F2F2"/>
-            <w:tcMar>
-              <w:top w:w="80" w:type="dxa"/>
-              <w:left w:w="120" w:type="dxa"/>
-              <w:bottom w:w="80" w:type="dxa"/>
-              <w:right w:w="120" w:type="dxa"/>
-            </w:tcMar>
           </w:tcPr>
           <w:p>
             <w:pPr>
@@ -8726,12 +8020,6 @@
               <w:right w:val="single" w:sz="4" w:space="0" w:color="C8D0DC"/>
             </w:tcBorders>
             <w:shd w:val="clear" w:color="auto" w:fill="F2F2F2"/>
-            <w:tcMar>
-              <w:top w:w="80" w:type="dxa"/>
-              <w:left w:w="120" w:type="dxa"/>
-              <w:bottom w:w="80" w:type="dxa"/>
-              <w:right w:w="120" w:type="dxa"/>
-            </w:tcMar>
           </w:tcPr>
           <w:p>
             <w:pPr>
@@ -8755,12 +8043,6 @@
               <w:right w:val="single" w:sz="4" w:space="0" w:color="C8D0DC"/>
             </w:tcBorders>
             <w:shd w:val="clear" w:color="auto" w:fill="F2F2F2"/>
-            <w:tcMar>
-              <w:top w:w="80" w:type="dxa"/>
-              <w:left w:w="120" w:type="dxa"/>
-              <w:bottom w:w="80" w:type="dxa"/>
-              <w:right w:w="120" w:type="dxa"/>
-            </w:tcMar>
           </w:tcPr>
           <w:p>
             <w:pPr>
@@ -8786,12 +8068,6 @@
               <w:right w:val="single" w:sz="4" w:space="0" w:color="C8D0DC"/>
             </w:tcBorders>
             <w:shd w:val="clear" w:color="auto" w:fill="FFFFFF"/>
-            <w:tcMar>
-              <w:top w:w="80" w:type="dxa"/>
-              <w:left w:w="120" w:type="dxa"/>
-              <w:bottom w:w="80" w:type="dxa"/>
-              <w:right w:w="120" w:type="dxa"/>
-            </w:tcMar>
           </w:tcPr>
           <w:p>
             <w:pPr>
@@ -8815,12 +8091,6 @@
               <w:right w:val="single" w:sz="4" w:space="0" w:color="C8D0DC"/>
             </w:tcBorders>
             <w:shd w:val="clear" w:color="auto" w:fill="FFFFFF"/>
-            <w:tcMar>
-              <w:top w:w="80" w:type="dxa"/>
-              <w:left w:w="120" w:type="dxa"/>
-              <w:bottom w:w="80" w:type="dxa"/>
-              <w:right w:w="120" w:type="dxa"/>
-            </w:tcMar>
           </w:tcPr>
           <w:p>
             <w:pPr>
@@ -8844,12 +8114,6 @@
               <w:right w:val="single" w:sz="4" w:space="0" w:color="C8D0DC"/>
             </w:tcBorders>
             <w:shd w:val="clear" w:color="auto" w:fill="FFFFFF"/>
-            <w:tcMar>
-              <w:top w:w="80" w:type="dxa"/>
-              <w:left w:w="120" w:type="dxa"/>
-              <w:bottom w:w="80" w:type="dxa"/>
-              <w:right w:w="120" w:type="dxa"/>
-            </w:tcMar>
           </w:tcPr>
           <w:p>
             <w:pPr>
@@ -8875,12 +8139,6 @@
               <w:right w:val="single" w:sz="4" w:space="0" w:color="C8D0DC"/>
             </w:tcBorders>
             <w:shd w:val="clear" w:color="auto" w:fill="F2F2F2"/>
-            <w:tcMar>
-              <w:top w:w="80" w:type="dxa"/>
-              <w:left w:w="120" w:type="dxa"/>
-              <w:bottom w:w="80" w:type="dxa"/>
-              <w:right w:w="120" w:type="dxa"/>
-            </w:tcMar>
           </w:tcPr>
           <w:p>
             <w:pPr>
@@ -8904,12 +8162,6 @@
               <w:right w:val="single" w:sz="4" w:space="0" w:color="C8D0DC"/>
             </w:tcBorders>
             <w:shd w:val="clear" w:color="auto" w:fill="F2F2F2"/>
-            <w:tcMar>
-              <w:top w:w="80" w:type="dxa"/>
-              <w:left w:w="120" w:type="dxa"/>
-              <w:bottom w:w="80" w:type="dxa"/>
-              <w:right w:w="120" w:type="dxa"/>
-            </w:tcMar>
           </w:tcPr>
           <w:p>
             <w:pPr>
@@ -8933,12 +8185,6 @@
               <w:right w:val="single" w:sz="4" w:space="0" w:color="C8D0DC"/>
             </w:tcBorders>
             <w:shd w:val="clear" w:color="auto" w:fill="F2F2F2"/>
-            <w:tcMar>
-              <w:top w:w="80" w:type="dxa"/>
-              <w:left w:w="120" w:type="dxa"/>
-              <w:bottom w:w="80" w:type="dxa"/>
-              <w:right w:w="120" w:type="dxa"/>
-            </w:tcMar>
           </w:tcPr>
           <w:p>
             <w:pPr>
@@ -8964,12 +8210,6 @@
               <w:right w:val="single" w:sz="4" w:space="0" w:color="C8D0DC"/>
             </w:tcBorders>
             <w:shd w:val="clear" w:color="auto" w:fill="FFFFFF"/>
-            <w:tcMar>
-              <w:top w:w="80" w:type="dxa"/>
-              <w:left w:w="120" w:type="dxa"/>
-              <w:bottom w:w="80" w:type="dxa"/>
-              <w:right w:w="120" w:type="dxa"/>
-            </w:tcMar>
           </w:tcPr>
           <w:p>
             <w:pPr>
@@ -8993,12 +8233,6 @@
               <w:right w:val="single" w:sz="4" w:space="0" w:color="C8D0DC"/>
             </w:tcBorders>
             <w:shd w:val="clear" w:color="auto" w:fill="FFFFFF"/>
-            <w:tcMar>
-              <w:top w:w="80" w:type="dxa"/>
-              <w:left w:w="120" w:type="dxa"/>
-              <w:bottom w:w="80" w:type="dxa"/>
-              <w:right w:w="120" w:type="dxa"/>
-            </w:tcMar>
           </w:tcPr>
           <w:p>
             <w:pPr>
@@ -9022,12 +8256,6 @@
               <w:right w:val="single" w:sz="4" w:space="0" w:color="C8D0DC"/>
             </w:tcBorders>
             <w:shd w:val="clear" w:color="auto" w:fill="FFFFFF"/>
-            <w:tcMar>
-              <w:top w:w="80" w:type="dxa"/>
-              <w:left w:w="120" w:type="dxa"/>
-              <w:bottom w:w="80" w:type="dxa"/>
-              <w:right w:w="120" w:type="dxa"/>
-            </w:tcMar>
           </w:tcPr>
           <w:p>
             <w:pPr>
@@ -9053,12 +8281,6 @@
               <w:right w:val="single" w:sz="4" w:space="0" w:color="C8D0DC"/>
             </w:tcBorders>
             <w:shd w:val="clear" w:color="auto" w:fill="F2F2F2"/>
-            <w:tcMar>
-              <w:top w:w="80" w:type="dxa"/>
-              <w:left w:w="120" w:type="dxa"/>
-              <w:bottom w:w="80" w:type="dxa"/>
-              <w:right w:w="120" w:type="dxa"/>
-            </w:tcMar>
           </w:tcPr>
           <w:p>
             <w:pPr>
@@ -9082,12 +8304,6 @@
               <w:right w:val="single" w:sz="4" w:space="0" w:color="C8D0DC"/>
             </w:tcBorders>
             <w:shd w:val="clear" w:color="auto" w:fill="F2F2F2"/>
-            <w:tcMar>
-              <w:top w:w="80" w:type="dxa"/>
-              <w:left w:w="120" w:type="dxa"/>
-              <w:bottom w:w="80" w:type="dxa"/>
-              <w:right w:w="120" w:type="dxa"/>
-            </w:tcMar>
           </w:tcPr>
           <w:p>
             <w:pPr>
@@ -9111,12 +8327,6 @@
               <w:right w:val="single" w:sz="4" w:space="0" w:color="C8D0DC"/>
             </w:tcBorders>
             <w:shd w:val="clear" w:color="auto" w:fill="F2F2F2"/>
-            <w:tcMar>
-              <w:top w:w="80" w:type="dxa"/>
-              <w:left w:w="120" w:type="dxa"/>
-              <w:bottom w:w="80" w:type="dxa"/>
-              <w:right w:w="120" w:type="dxa"/>
-            </w:tcMar>
           </w:tcPr>
           <w:p>
             <w:pPr>
@@ -9142,12 +8352,6 @@
               <w:right w:val="single" w:sz="4" w:space="0" w:color="C8D0DC"/>
             </w:tcBorders>
             <w:shd w:val="clear" w:color="auto" w:fill="FFFFFF"/>
-            <w:tcMar>
-              <w:top w:w="80" w:type="dxa"/>
-              <w:left w:w="120" w:type="dxa"/>
-              <w:bottom w:w="80" w:type="dxa"/>
-              <w:right w:w="120" w:type="dxa"/>
-            </w:tcMar>
           </w:tcPr>
           <w:p>
             <w:pPr>
@@ -9171,12 +8375,6 @@
               <w:right w:val="single" w:sz="4" w:space="0" w:color="C8D0DC"/>
             </w:tcBorders>
             <w:shd w:val="clear" w:color="auto" w:fill="FFFFFF"/>
-            <w:tcMar>
-              <w:top w:w="80" w:type="dxa"/>
-              <w:left w:w="120" w:type="dxa"/>
-              <w:bottom w:w="80" w:type="dxa"/>
-              <w:right w:w="120" w:type="dxa"/>
-            </w:tcMar>
           </w:tcPr>
           <w:p>
             <w:pPr>
@@ -9200,12 +8398,6 @@
               <w:right w:val="single" w:sz="4" w:space="0" w:color="C8D0DC"/>
             </w:tcBorders>
             <w:shd w:val="clear" w:color="auto" w:fill="FFFFFF"/>
-            <w:tcMar>
-              <w:top w:w="80" w:type="dxa"/>
-              <w:left w:w="120" w:type="dxa"/>
-              <w:bottom w:w="80" w:type="dxa"/>
-              <w:right w:w="120" w:type="dxa"/>
-            </w:tcMar>
           </w:tcPr>
           <w:p>
             <w:pPr>
@@ -9231,12 +8423,6 @@
               <w:right w:val="single" w:sz="4" w:space="0" w:color="C8D0DC"/>
             </w:tcBorders>
             <w:shd w:val="clear" w:color="auto" w:fill="F2F2F2"/>
-            <w:tcMar>
-              <w:top w:w="80" w:type="dxa"/>
-              <w:left w:w="120" w:type="dxa"/>
-              <w:bottom w:w="80" w:type="dxa"/>
-              <w:right w:w="120" w:type="dxa"/>
-            </w:tcMar>
           </w:tcPr>
           <w:p>
             <w:pPr>
@@ -9260,12 +8446,6 @@
               <w:right w:val="single" w:sz="4" w:space="0" w:color="C8D0DC"/>
             </w:tcBorders>
             <w:shd w:val="clear" w:color="auto" w:fill="F2F2F2"/>
-            <w:tcMar>
-              <w:top w:w="80" w:type="dxa"/>
-              <w:left w:w="120" w:type="dxa"/>
-              <w:bottom w:w="80" w:type="dxa"/>
-              <w:right w:w="120" w:type="dxa"/>
-            </w:tcMar>
           </w:tcPr>
           <w:p>
             <w:pPr>
@@ -9289,12 +8469,6 @@
               <w:right w:val="single" w:sz="4" w:space="0" w:color="C8D0DC"/>
             </w:tcBorders>
             <w:shd w:val="clear" w:color="auto" w:fill="F2F2F2"/>
-            <w:tcMar>
-              <w:top w:w="80" w:type="dxa"/>
-              <w:left w:w="120" w:type="dxa"/>
-              <w:bottom w:w="80" w:type="dxa"/>
-              <w:right w:w="120" w:type="dxa"/>
-            </w:tcMar>
           </w:tcPr>
           <w:p>
             <w:pPr>
@@ -9320,12 +8494,6 @@
               <w:right w:val="single" w:sz="4" w:space="0" w:color="C8D0DC"/>
             </w:tcBorders>
             <w:shd w:val="clear" w:color="auto" w:fill="FFFFFF"/>
-            <w:tcMar>
-              <w:top w:w="80" w:type="dxa"/>
-              <w:left w:w="120" w:type="dxa"/>
-              <w:bottom w:w="80" w:type="dxa"/>
-              <w:right w:w="120" w:type="dxa"/>
-            </w:tcMar>
           </w:tcPr>
           <w:p>
             <w:pPr>
@@ -9351,12 +8519,6 @@
               <w:right w:val="single" w:sz="4" w:space="0" w:color="C8D0DC"/>
             </w:tcBorders>
             <w:shd w:val="clear" w:color="auto" w:fill="FFFFFF"/>
-            <w:tcMar>
-              <w:top w:w="80" w:type="dxa"/>
-              <w:left w:w="120" w:type="dxa"/>
-              <w:bottom w:w="80" w:type="dxa"/>
-              <w:right w:w="120" w:type="dxa"/>
-            </w:tcMar>
           </w:tcPr>
           <w:p>
             <w:pPr>
@@ -9382,12 +8544,6 @@
               <w:right w:val="single" w:sz="4" w:space="0" w:color="C8D0DC"/>
             </w:tcBorders>
             <w:shd w:val="clear" w:color="auto" w:fill="FFFFFF"/>
-            <w:tcMar>
-              <w:top w:w="80" w:type="dxa"/>
-              <w:left w:w="120" w:type="dxa"/>
-              <w:bottom w:w="80" w:type="dxa"/>
-              <w:right w:w="120" w:type="dxa"/>
-            </w:tcMar>
           </w:tcPr>
           <w:p>
             <w:pPr>
@@ -9415,12 +8571,6 @@
               <w:right w:val="single" w:sz="4" w:space="0" w:color="C8D0DC"/>
             </w:tcBorders>
             <w:shd w:val="clear" w:color="auto" w:fill="F2F2F2"/>
-            <w:tcMar>
-              <w:top w:w="80" w:type="dxa"/>
-              <w:left w:w="120" w:type="dxa"/>
-              <w:bottom w:w="80" w:type="dxa"/>
-              <w:right w:w="120" w:type="dxa"/>
-            </w:tcMar>
           </w:tcPr>
           <w:p>
             <w:pPr>
@@ -9446,12 +8596,6 @@
               <w:right w:val="single" w:sz="4" w:space="0" w:color="C8D0DC"/>
             </w:tcBorders>
             <w:shd w:val="clear" w:color="auto" w:fill="F2F2F2"/>
-            <w:tcMar>
-              <w:top w:w="80" w:type="dxa"/>
-              <w:left w:w="120" w:type="dxa"/>
-              <w:bottom w:w="80" w:type="dxa"/>
-              <w:right w:w="120" w:type="dxa"/>
-            </w:tcMar>
           </w:tcPr>
           <w:p>
             <w:pPr>
@@ -9477,12 +8621,6 @@
               <w:right w:val="single" w:sz="4" w:space="0" w:color="C8D0DC"/>
             </w:tcBorders>
             <w:shd w:val="clear" w:color="auto" w:fill="F2F2F2"/>
-            <w:tcMar>
-              <w:top w:w="80" w:type="dxa"/>
-              <w:left w:w="120" w:type="dxa"/>
-              <w:bottom w:w="80" w:type="dxa"/>
-              <w:right w:w="120" w:type="dxa"/>
-            </w:tcMar>
           </w:tcPr>
           <w:p>
             <w:pPr>
@@ -9524,7 +8662,7 @@
           <w:noProof/>
         </w:rPr>
         <w:drawing>
-          <wp:inline distT="0" distB="0" distL="0" distR="0" wp14:anchorId="4993DFAF" wp14:editId="48F91EF4">
+          <wp:inline distT="0" distB="0" distL="0" distR="0" wp14:anchorId="30924B1D" wp14:editId="77586BFA">
             <wp:extent cx="5334000" cy="2844800"/>
             <wp:effectExtent l="0" t="0" r="0" b="0"/>
             <wp:docPr id="79" name="Picture" descr="Implementation Roadmap: Network First, Platforms Second"/>
@@ -9579,7 +8717,7 @@
         <w:pStyle w:val="Heading1"/>
       </w:pPr>
       <w:bookmarkStart w:id="58" w:name="implementation-roadmap"/>
-      <w:bookmarkStart w:id="59" w:name="_Toc233786892"/>
+      <w:bookmarkStart w:id="59" w:name="_Toc233815425"/>
       <w:bookmarkEnd w:id="48"/>
       <w:bookmarkEnd w:id="56"/>
       <w:r>
@@ -9613,7 +8751,7 @@
         <w:pStyle w:val="Heading2"/>
       </w:pPr>
       <w:bookmarkStart w:id="60" w:name="phase-1-network-foundation-months-13"/>
-      <w:bookmarkStart w:id="61" w:name="_Toc233786893"/>
+      <w:bookmarkStart w:id="61" w:name="_Toc233815426"/>
       <w:r>
         <w:t>8.1 Phase 1 — Network Foundation (Months 1–3)</w:t>
       </w:r>
@@ -9712,7 +8850,7 @@
         <w:pStyle w:val="Heading2"/>
       </w:pPr>
       <w:bookmarkStart w:id="62" w:name="Xfdd51caf3fe6a11d0a4df23f20af5ae637d7021"/>
-      <w:bookmarkStart w:id="63" w:name="_Toc233786894"/>
+      <w:bookmarkStart w:id="63" w:name="_Toc233815427"/>
       <w:bookmarkEnd w:id="60"/>
       <w:r>
         <w:t>8.2 Phase 2 — Amazon Connect Deployment (Months 2–5)</w:t>
@@ -9796,7 +8934,7 @@
         <w:pStyle w:val="Heading2"/>
       </w:pPr>
       <w:bookmarkStart w:id="64" w:name="phase-3-teams-phone-deployment-months-48"/>
-      <w:bookmarkStart w:id="65" w:name="_Toc233786895"/>
+      <w:bookmarkStart w:id="65" w:name="_Toc233815428"/>
       <w:bookmarkEnd w:id="62"/>
       <w:r>
         <w:t>8.3 Phase 3 — Teams Phone Deployment (Months 4–8)</w:t>
@@ -9880,7 +9018,7 @@
         <w:pStyle w:val="Heading2"/>
       </w:pPr>
       <w:bookmarkStart w:id="66" w:name="X9d7b7ecc3f0b58540fc3182ad13f1c94567e114"/>
-      <w:bookmarkStart w:id="67" w:name="_Toc233786896"/>
+      <w:bookmarkStart w:id="67" w:name="_Toc233815429"/>
       <w:bookmarkEnd w:id="64"/>
       <w:r>
         <w:t>8.4 Phase 4 — Continuous Monitoring and FedRAMP 20x Alignment (Months 6+)</w:t>
@@ -9959,7 +9097,7 @@
         <w:pStyle w:val="Heading1"/>
       </w:pPr>
       <w:bookmarkStart w:id="68" w:name="federal-framework-alignment"/>
-      <w:bookmarkStart w:id="69" w:name="_Toc233786897"/>
+      <w:bookmarkStart w:id="69" w:name="_Toc233815430"/>
       <w:bookmarkEnd w:id="58"/>
       <w:bookmarkEnd w:id="66"/>
       <w:r>
@@ -9970,17 +9108,18 @@
     <w:tbl>
       <w:tblPr>
         <w:tblStyle w:val="Table"/>
-        <w:tblW w:w="9360" w:type="dxa"/>
+        <w:tblW w:w="5000" w:type="pct"/>
         <w:tblLayout w:type="fixed"/>
-        <w:tblLook w:val="0600" w:firstRow="0" w:lastRow="0" w:firstColumn="0" w:lastColumn="0" w:noHBand="1" w:noVBand="1"/>
+        <w:tblLook w:val="0020" w:firstRow="1" w:lastRow="0" w:firstColumn="0" w:lastColumn="0" w:noHBand="0" w:noVBand="0"/>
       </w:tblPr>
       <w:tblGrid>
-        <w:gridCol w:w="3120"/>
-        <w:gridCol w:w="3120"/>
-        <w:gridCol w:w="3120"/>
+        <w:gridCol w:w="3192"/>
+        <w:gridCol w:w="3192"/>
+        <w:gridCol w:w="3192"/>
       </w:tblGrid>
       <w:tr>
         <w:trPr>
+          <w:cnfStyle w:val="100000000000" w:firstRow="1" w:lastRow="0" w:firstColumn="0" w:lastColumn="0" w:oddVBand="0" w:evenVBand="0" w:oddHBand="0" w:evenHBand="0" w:firstRowFirstColumn="0" w:firstRowLastColumn="0" w:lastRowFirstColumn="0" w:lastRowLastColumn="0"/>
           <w:tblHeader/>
         </w:trPr>
         <w:tc>
@@ -9993,12 +9132,6 @@
               <w:right w:val="single" w:sz="4" w:space="0" w:color="C8D0DC"/>
             </w:tcBorders>
             <w:shd w:val="clear" w:color="auto" w:fill="1F3864"/>
-            <w:tcMar>
-              <w:top w:w="80" w:type="dxa"/>
-              <w:left w:w="120" w:type="dxa"/>
-              <w:bottom w:w="80" w:type="dxa"/>
-              <w:right w:w="120" w:type="dxa"/>
-            </w:tcMar>
           </w:tcPr>
           <w:p>
             <w:pPr>
@@ -10024,12 +9157,6 @@
               <w:right w:val="single" w:sz="4" w:space="0" w:color="C8D0DC"/>
             </w:tcBorders>
             <w:shd w:val="clear" w:color="auto" w:fill="1F3864"/>
-            <w:tcMar>
-              <w:top w:w="80" w:type="dxa"/>
-              <w:left w:w="120" w:type="dxa"/>
-              <w:bottom w:w="80" w:type="dxa"/>
-              <w:right w:w="120" w:type="dxa"/>
-            </w:tcMar>
           </w:tcPr>
           <w:p>
             <w:pPr>
@@ -10055,12 +9182,6 @@
               <w:right w:val="single" w:sz="4" w:space="0" w:color="C8D0DC"/>
             </w:tcBorders>
             <w:shd w:val="clear" w:color="auto" w:fill="1F3864"/>
-            <w:tcMar>
-              <w:top w:w="80" w:type="dxa"/>
-              <w:left w:w="120" w:type="dxa"/>
-              <w:bottom w:w="80" w:type="dxa"/>
-              <w:right w:w="120" w:type="dxa"/>
-            </w:tcMar>
           </w:tcPr>
           <w:p>
             <w:pPr>
@@ -10088,12 +9209,6 @@
               <w:right w:val="single" w:sz="4" w:space="0" w:color="C8D0DC"/>
             </w:tcBorders>
             <w:shd w:val="clear" w:color="auto" w:fill="FFFFFF"/>
-            <w:tcMar>
-              <w:top w:w="80" w:type="dxa"/>
-              <w:left w:w="120" w:type="dxa"/>
-              <w:bottom w:w="80" w:type="dxa"/>
-              <w:right w:w="120" w:type="dxa"/>
-            </w:tcMar>
           </w:tcPr>
           <w:p>
             <w:pPr>
@@ -10117,12 +9232,6 @@
               <w:right w:val="single" w:sz="4" w:space="0" w:color="C8D0DC"/>
             </w:tcBorders>
             <w:shd w:val="clear" w:color="auto" w:fill="FFFFFF"/>
-            <w:tcMar>
-              <w:top w:w="80" w:type="dxa"/>
-              <w:left w:w="120" w:type="dxa"/>
-              <w:bottom w:w="80" w:type="dxa"/>
-              <w:right w:w="120" w:type="dxa"/>
-            </w:tcMar>
           </w:tcPr>
           <w:p>
             <w:pPr>
@@ -10146,12 +9255,6 @@
               <w:right w:val="single" w:sz="4" w:space="0" w:color="C8D0DC"/>
             </w:tcBorders>
             <w:shd w:val="clear" w:color="auto" w:fill="FFFFFF"/>
-            <w:tcMar>
-              <w:top w:w="80" w:type="dxa"/>
-              <w:left w:w="120" w:type="dxa"/>
-              <w:bottom w:w="80" w:type="dxa"/>
-              <w:right w:w="120" w:type="dxa"/>
-            </w:tcMar>
           </w:tcPr>
           <w:p>
             <w:pPr>
@@ -10177,12 +9280,6 @@
               <w:right w:val="single" w:sz="4" w:space="0" w:color="C8D0DC"/>
             </w:tcBorders>
             <w:shd w:val="clear" w:color="auto" w:fill="F2F2F2"/>
-            <w:tcMar>
-              <w:top w:w="80" w:type="dxa"/>
-              <w:left w:w="120" w:type="dxa"/>
-              <w:bottom w:w="80" w:type="dxa"/>
-              <w:right w:w="120" w:type="dxa"/>
-            </w:tcMar>
           </w:tcPr>
           <w:p>
             <w:pPr>
@@ -10206,12 +9303,6 @@
               <w:right w:val="single" w:sz="4" w:space="0" w:color="C8D0DC"/>
             </w:tcBorders>
             <w:shd w:val="clear" w:color="auto" w:fill="F2F2F2"/>
-            <w:tcMar>
-              <w:top w:w="80" w:type="dxa"/>
-              <w:left w:w="120" w:type="dxa"/>
-              <w:bottom w:w="80" w:type="dxa"/>
-              <w:right w:w="120" w:type="dxa"/>
-            </w:tcMar>
           </w:tcPr>
           <w:p>
             <w:pPr>
@@ -10235,12 +9326,6 @@
               <w:right w:val="single" w:sz="4" w:space="0" w:color="C8D0DC"/>
             </w:tcBorders>
             <w:shd w:val="clear" w:color="auto" w:fill="F2F2F2"/>
-            <w:tcMar>
-              <w:top w:w="80" w:type="dxa"/>
-              <w:left w:w="120" w:type="dxa"/>
-              <w:bottom w:w="80" w:type="dxa"/>
-              <w:right w:w="120" w:type="dxa"/>
-            </w:tcMar>
           </w:tcPr>
           <w:p>
             <w:pPr>
@@ -10266,12 +9351,6 @@
               <w:right w:val="single" w:sz="4" w:space="0" w:color="C8D0DC"/>
             </w:tcBorders>
             <w:shd w:val="clear" w:color="auto" w:fill="FFFFFF"/>
-            <w:tcMar>
-              <w:top w:w="80" w:type="dxa"/>
-              <w:left w:w="120" w:type="dxa"/>
-              <w:bottom w:w="80" w:type="dxa"/>
-              <w:right w:w="120" w:type="dxa"/>
-            </w:tcMar>
           </w:tcPr>
           <w:p>
             <w:pPr>
@@ -10295,12 +9374,6 @@
               <w:right w:val="single" w:sz="4" w:space="0" w:color="C8D0DC"/>
             </w:tcBorders>
             <w:shd w:val="clear" w:color="auto" w:fill="FFFFFF"/>
-            <w:tcMar>
-              <w:top w:w="80" w:type="dxa"/>
-              <w:left w:w="120" w:type="dxa"/>
-              <w:bottom w:w="80" w:type="dxa"/>
-              <w:right w:w="120" w:type="dxa"/>
-            </w:tcMar>
           </w:tcPr>
           <w:p>
             <w:pPr>
@@ -10324,12 +9397,6 @@
               <w:right w:val="single" w:sz="4" w:space="0" w:color="C8D0DC"/>
             </w:tcBorders>
             <w:shd w:val="clear" w:color="auto" w:fill="FFFFFF"/>
-            <w:tcMar>
-              <w:top w:w="80" w:type="dxa"/>
-              <w:left w:w="120" w:type="dxa"/>
-              <w:bottom w:w="80" w:type="dxa"/>
-              <w:right w:w="120" w:type="dxa"/>
-            </w:tcMar>
           </w:tcPr>
           <w:p>
             <w:pPr>
@@ -10355,12 +9422,6 @@
               <w:right w:val="single" w:sz="4" w:space="0" w:color="C8D0DC"/>
             </w:tcBorders>
             <w:shd w:val="clear" w:color="auto" w:fill="F2F2F2"/>
-            <w:tcMar>
-              <w:top w:w="80" w:type="dxa"/>
-              <w:left w:w="120" w:type="dxa"/>
-              <w:bottom w:w="80" w:type="dxa"/>
-              <w:right w:w="120" w:type="dxa"/>
-            </w:tcMar>
           </w:tcPr>
           <w:p>
             <w:pPr>
@@ -10384,12 +9445,6 @@
               <w:right w:val="single" w:sz="4" w:space="0" w:color="C8D0DC"/>
             </w:tcBorders>
             <w:shd w:val="clear" w:color="auto" w:fill="F2F2F2"/>
-            <w:tcMar>
-              <w:top w:w="80" w:type="dxa"/>
-              <w:left w:w="120" w:type="dxa"/>
-              <w:bottom w:w="80" w:type="dxa"/>
-              <w:right w:w="120" w:type="dxa"/>
-            </w:tcMar>
           </w:tcPr>
           <w:p>
             <w:pPr>
@@ -10413,12 +9468,6 @@
               <w:right w:val="single" w:sz="4" w:space="0" w:color="C8D0DC"/>
             </w:tcBorders>
             <w:shd w:val="clear" w:color="auto" w:fill="F2F2F2"/>
-            <w:tcMar>
-              <w:top w:w="80" w:type="dxa"/>
-              <w:left w:w="120" w:type="dxa"/>
-              <w:bottom w:w="80" w:type="dxa"/>
-              <w:right w:w="120" w:type="dxa"/>
-            </w:tcMar>
           </w:tcPr>
           <w:p>
             <w:pPr>
@@ -10444,12 +9493,6 @@
               <w:right w:val="single" w:sz="4" w:space="0" w:color="C8D0DC"/>
             </w:tcBorders>
             <w:shd w:val="clear" w:color="auto" w:fill="FFFFFF"/>
-            <w:tcMar>
-              <w:top w:w="80" w:type="dxa"/>
-              <w:left w:w="120" w:type="dxa"/>
-              <w:bottom w:w="80" w:type="dxa"/>
-              <w:right w:w="120" w:type="dxa"/>
-            </w:tcMar>
           </w:tcPr>
           <w:p>
             <w:pPr>
@@ -10473,12 +9516,6 @@
               <w:right w:val="single" w:sz="4" w:space="0" w:color="C8D0DC"/>
             </w:tcBorders>
             <w:shd w:val="clear" w:color="auto" w:fill="FFFFFF"/>
-            <w:tcMar>
-              <w:top w:w="80" w:type="dxa"/>
-              <w:left w:w="120" w:type="dxa"/>
-              <w:bottom w:w="80" w:type="dxa"/>
-              <w:right w:w="120" w:type="dxa"/>
-            </w:tcMar>
           </w:tcPr>
           <w:p>
             <w:pPr>
@@ -10502,12 +9539,6 @@
               <w:right w:val="single" w:sz="4" w:space="0" w:color="C8D0DC"/>
             </w:tcBorders>
             <w:shd w:val="clear" w:color="auto" w:fill="FFFFFF"/>
-            <w:tcMar>
-              <w:top w:w="80" w:type="dxa"/>
-              <w:left w:w="120" w:type="dxa"/>
-              <w:bottom w:w="80" w:type="dxa"/>
-              <w:right w:w="120" w:type="dxa"/>
-            </w:tcMar>
           </w:tcPr>
           <w:p>
             <w:pPr>
@@ -10533,12 +9564,6 @@
               <w:right w:val="single" w:sz="4" w:space="0" w:color="C8D0DC"/>
             </w:tcBorders>
             <w:shd w:val="clear" w:color="auto" w:fill="F2F2F2"/>
-            <w:tcMar>
-              <w:top w:w="80" w:type="dxa"/>
-              <w:left w:w="120" w:type="dxa"/>
-              <w:bottom w:w="80" w:type="dxa"/>
-              <w:right w:w="120" w:type="dxa"/>
-            </w:tcMar>
           </w:tcPr>
           <w:p>
             <w:pPr>
@@ -10562,12 +9587,6 @@
               <w:right w:val="single" w:sz="4" w:space="0" w:color="C8D0DC"/>
             </w:tcBorders>
             <w:shd w:val="clear" w:color="auto" w:fill="F2F2F2"/>
-            <w:tcMar>
-              <w:top w:w="80" w:type="dxa"/>
-              <w:left w:w="120" w:type="dxa"/>
-              <w:bottom w:w="80" w:type="dxa"/>
-              <w:right w:w="120" w:type="dxa"/>
-            </w:tcMar>
           </w:tcPr>
           <w:p>
             <w:pPr>
@@ -10591,12 +9610,6 @@
               <w:right w:val="single" w:sz="4" w:space="0" w:color="C8D0DC"/>
             </w:tcBorders>
             <w:shd w:val="clear" w:color="auto" w:fill="F2F2F2"/>
-            <w:tcMar>
-              <w:top w:w="80" w:type="dxa"/>
-              <w:left w:w="120" w:type="dxa"/>
-              <w:bottom w:w="80" w:type="dxa"/>
-              <w:right w:w="120" w:type="dxa"/>
-            </w:tcMar>
           </w:tcPr>
           <w:p>
             <w:pPr>
@@ -10622,12 +9635,6 @@
               <w:right w:val="single" w:sz="4" w:space="0" w:color="C8D0DC"/>
             </w:tcBorders>
             <w:shd w:val="clear" w:color="auto" w:fill="FFFFFF"/>
-            <w:tcMar>
-              <w:top w:w="80" w:type="dxa"/>
-              <w:left w:w="120" w:type="dxa"/>
-              <w:bottom w:w="80" w:type="dxa"/>
-              <w:right w:w="120" w:type="dxa"/>
-            </w:tcMar>
           </w:tcPr>
           <w:p>
             <w:pPr>
@@ -10651,12 +9658,6 @@
               <w:right w:val="single" w:sz="4" w:space="0" w:color="C8D0DC"/>
             </w:tcBorders>
             <w:shd w:val="clear" w:color="auto" w:fill="FFFFFF"/>
-            <w:tcMar>
-              <w:top w:w="80" w:type="dxa"/>
-              <w:left w:w="120" w:type="dxa"/>
-              <w:bottom w:w="80" w:type="dxa"/>
-              <w:right w:w="120" w:type="dxa"/>
-            </w:tcMar>
           </w:tcPr>
           <w:p>
             <w:pPr>
@@ -10680,12 +9681,6 @@
               <w:right w:val="single" w:sz="4" w:space="0" w:color="C8D0DC"/>
             </w:tcBorders>
             <w:shd w:val="clear" w:color="auto" w:fill="FFFFFF"/>
-            <w:tcMar>
-              <w:top w:w="80" w:type="dxa"/>
-              <w:left w:w="120" w:type="dxa"/>
-              <w:bottom w:w="80" w:type="dxa"/>
-              <w:right w:w="120" w:type="dxa"/>
-            </w:tcMar>
           </w:tcPr>
           <w:p>
             <w:pPr>
@@ -10711,12 +9706,6 @@
               <w:right w:val="single" w:sz="4" w:space="0" w:color="C8D0DC"/>
             </w:tcBorders>
             <w:shd w:val="clear" w:color="auto" w:fill="F2F2F2"/>
-            <w:tcMar>
-              <w:top w:w="80" w:type="dxa"/>
-              <w:left w:w="120" w:type="dxa"/>
-              <w:bottom w:w="80" w:type="dxa"/>
-              <w:right w:w="120" w:type="dxa"/>
-            </w:tcMar>
           </w:tcPr>
           <w:p>
             <w:pPr>
@@ -10740,12 +9729,6 @@
               <w:right w:val="single" w:sz="4" w:space="0" w:color="C8D0DC"/>
             </w:tcBorders>
             <w:shd w:val="clear" w:color="auto" w:fill="F2F2F2"/>
-            <w:tcMar>
-              <w:top w:w="80" w:type="dxa"/>
-              <w:left w:w="120" w:type="dxa"/>
-              <w:bottom w:w="80" w:type="dxa"/>
-              <w:right w:w="120" w:type="dxa"/>
-            </w:tcMar>
           </w:tcPr>
           <w:p>
             <w:pPr>
@@ -10769,12 +9752,6 @@
               <w:right w:val="single" w:sz="4" w:space="0" w:color="C8D0DC"/>
             </w:tcBorders>
             <w:shd w:val="clear" w:color="auto" w:fill="F2F2F2"/>
-            <w:tcMar>
-              <w:top w:w="80" w:type="dxa"/>
-              <w:left w:w="120" w:type="dxa"/>
-              <w:bottom w:w="80" w:type="dxa"/>
-              <w:right w:w="120" w:type="dxa"/>
-            </w:tcMar>
           </w:tcPr>
           <w:p>
             <w:pPr>
@@ -10800,12 +9777,6 @@
               <w:right w:val="single" w:sz="4" w:space="0" w:color="C8D0DC"/>
             </w:tcBorders>
             <w:shd w:val="clear" w:color="auto" w:fill="FFFFFF"/>
-            <w:tcMar>
-              <w:top w:w="80" w:type="dxa"/>
-              <w:left w:w="120" w:type="dxa"/>
-              <w:bottom w:w="80" w:type="dxa"/>
-              <w:right w:w="120" w:type="dxa"/>
-            </w:tcMar>
           </w:tcPr>
           <w:p>
             <w:pPr>
@@ -10829,12 +9800,6 @@
               <w:right w:val="single" w:sz="4" w:space="0" w:color="C8D0DC"/>
             </w:tcBorders>
             <w:shd w:val="clear" w:color="auto" w:fill="FFFFFF"/>
-            <w:tcMar>
-              <w:top w:w="80" w:type="dxa"/>
-              <w:left w:w="120" w:type="dxa"/>
-              <w:bottom w:w="80" w:type="dxa"/>
-              <w:right w:w="120" w:type="dxa"/>
-            </w:tcMar>
           </w:tcPr>
           <w:p>
             <w:pPr>
@@ -10858,12 +9823,6 @@
               <w:right w:val="single" w:sz="4" w:space="0" w:color="C8D0DC"/>
             </w:tcBorders>
             <w:shd w:val="clear" w:color="auto" w:fill="FFFFFF"/>
-            <w:tcMar>
-              <w:top w:w="80" w:type="dxa"/>
-              <w:left w:w="120" w:type="dxa"/>
-              <w:bottom w:w="80" w:type="dxa"/>
-              <w:right w:w="120" w:type="dxa"/>
-            </w:tcMar>
           </w:tcPr>
           <w:p>
             <w:pPr>
@@ -10889,12 +9848,6 @@
               <w:right w:val="single" w:sz="4" w:space="0" w:color="C8D0DC"/>
             </w:tcBorders>
             <w:shd w:val="clear" w:color="auto" w:fill="F2F2F2"/>
-            <w:tcMar>
-              <w:top w:w="80" w:type="dxa"/>
-              <w:left w:w="120" w:type="dxa"/>
-              <w:bottom w:w="80" w:type="dxa"/>
-              <w:right w:w="120" w:type="dxa"/>
-            </w:tcMar>
           </w:tcPr>
           <w:p>
             <w:pPr>
@@ -10918,12 +9871,6 @@
               <w:right w:val="single" w:sz="4" w:space="0" w:color="C8D0DC"/>
             </w:tcBorders>
             <w:shd w:val="clear" w:color="auto" w:fill="F2F2F2"/>
-            <w:tcMar>
-              <w:top w:w="80" w:type="dxa"/>
-              <w:left w:w="120" w:type="dxa"/>
-              <w:bottom w:w="80" w:type="dxa"/>
-              <w:right w:w="120" w:type="dxa"/>
-            </w:tcMar>
           </w:tcPr>
           <w:p>
             <w:pPr>
@@ -10947,12 +9894,6 @@
               <w:right w:val="single" w:sz="4" w:space="0" w:color="C8D0DC"/>
             </w:tcBorders>
             <w:shd w:val="clear" w:color="auto" w:fill="F2F2F2"/>
-            <w:tcMar>
-              <w:top w:w="80" w:type="dxa"/>
-              <w:left w:w="120" w:type="dxa"/>
-              <w:bottom w:w="80" w:type="dxa"/>
-              <w:right w:w="120" w:type="dxa"/>
-            </w:tcMar>
           </w:tcPr>
           <w:p>
             <w:pPr>
@@ -10978,12 +9919,6 @@
               <w:right w:val="single" w:sz="4" w:space="0" w:color="C8D0DC"/>
             </w:tcBorders>
             <w:shd w:val="clear" w:color="auto" w:fill="FFFFFF"/>
-            <w:tcMar>
-              <w:top w:w="80" w:type="dxa"/>
-              <w:left w:w="120" w:type="dxa"/>
-              <w:bottom w:w="80" w:type="dxa"/>
-              <w:right w:w="120" w:type="dxa"/>
-            </w:tcMar>
           </w:tcPr>
           <w:p>
             <w:pPr>
@@ -11007,12 +9942,6 @@
               <w:right w:val="single" w:sz="4" w:space="0" w:color="C8D0DC"/>
             </w:tcBorders>
             <w:shd w:val="clear" w:color="auto" w:fill="FFFFFF"/>
-            <w:tcMar>
-              <w:top w:w="80" w:type="dxa"/>
-              <w:left w:w="120" w:type="dxa"/>
-              <w:bottom w:w="80" w:type="dxa"/>
-              <w:right w:w="120" w:type="dxa"/>
-            </w:tcMar>
           </w:tcPr>
           <w:p>
             <w:pPr>
@@ -11036,12 +9965,6 @@
               <w:right w:val="single" w:sz="4" w:space="0" w:color="C8D0DC"/>
             </w:tcBorders>
             <w:shd w:val="clear" w:color="auto" w:fill="FFFFFF"/>
-            <w:tcMar>
-              <w:top w:w="80" w:type="dxa"/>
-              <w:left w:w="120" w:type="dxa"/>
-              <w:bottom w:w="80" w:type="dxa"/>
-              <w:right w:w="120" w:type="dxa"/>
-            </w:tcMar>
           </w:tcPr>
           <w:p>
             <w:pPr>
@@ -11067,12 +9990,6 @@
               <w:right w:val="single" w:sz="4" w:space="0" w:color="C8D0DC"/>
             </w:tcBorders>
             <w:shd w:val="clear" w:color="auto" w:fill="F2F2F2"/>
-            <w:tcMar>
-              <w:top w:w="80" w:type="dxa"/>
-              <w:left w:w="120" w:type="dxa"/>
-              <w:bottom w:w="80" w:type="dxa"/>
-              <w:right w:w="120" w:type="dxa"/>
-            </w:tcMar>
           </w:tcPr>
           <w:p>
             <w:pPr>
@@ -11096,12 +10013,6 @@
               <w:right w:val="single" w:sz="4" w:space="0" w:color="C8D0DC"/>
             </w:tcBorders>
             <w:shd w:val="clear" w:color="auto" w:fill="F2F2F2"/>
-            <w:tcMar>
-              <w:top w:w="80" w:type="dxa"/>
-              <w:left w:w="120" w:type="dxa"/>
-              <w:bottom w:w="80" w:type="dxa"/>
-              <w:right w:w="120" w:type="dxa"/>
-            </w:tcMar>
           </w:tcPr>
           <w:p>
             <w:pPr>
@@ -11125,12 +10036,6 @@
               <w:right w:val="single" w:sz="4" w:space="0" w:color="C8D0DC"/>
             </w:tcBorders>
             <w:shd w:val="clear" w:color="auto" w:fill="F2F2F2"/>
-            <w:tcMar>
-              <w:top w:w="80" w:type="dxa"/>
-              <w:left w:w="120" w:type="dxa"/>
-              <w:bottom w:w="80" w:type="dxa"/>
-              <w:right w:w="120" w:type="dxa"/>
-            </w:tcMar>
           </w:tcPr>
           <w:p>
             <w:pPr>
@@ -11156,12 +10061,6 @@
               <w:right w:val="single" w:sz="4" w:space="0" w:color="C8D0DC"/>
             </w:tcBorders>
             <w:shd w:val="clear" w:color="auto" w:fill="FFFFFF"/>
-            <w:tcMar>
-              <w:top w:w="80" w:type="dxa"/>
-              <w:left w:w="120" w:type="dxa"/>
-              <w:bottom w:w="80" w:type="dxa"/>
-              <w:right w:w="120" w:type="dxa"/>
-            </w:tcMar>
           </w:tcPr>
           <w:p>
             <w:pPr>
@@ -11185,12 +10084,6 @@
               <w:right w:val="single" w:sz="4" w:space="0" w:color="C8D0DC"/>
             </w:tcBorders>
             <w:shd w:val="clear" w:color="auto" w:fill="FFFFFF"/>
-            <w:tcMar>
-              <w:top w:w="80" w:type="dxa"/>
-              <w:left w:w="120" w:type="dxa"/>
-              <w:bottom w:w="80" w:type="dxa"/>
-              <w:right w:w="120" w:type="dxa"/>
-            </w:tcMar>
           </w:tcPr>
           <w:p>
             <w:pPr>
@@ -11214,12 +10107,6 @@
               <w:right w:val="single" w:sz="4" w:space="0" w:color="C8D0DC"/>
             </w:tcBorders>
             <w:shd w:val="clear" w:color="auto" w:fill="FFFFFF"/>
-            <w:tcMar>
-              <w:top w:w="80" w:type="dxa"/>
-              <w:left w:w="120" w:type="dxa"/>
-              <w:bottom w:w="80" w:type="dxa"/>
-              <w:right w:w="120" w:type="dxa"/>
-            </w:tcMar>
           </w:tcPr>
           <w:p>
             <w:pPr>
@@ -11245,12 +10132,6 @@
               <w:right w:val="single" w:sz="4" w:space="0" w:color="C8D0DC"/>
             </w:tcBorders>
             <w:shd w:val="clear" w:color="auto" w:fill="F2F2F2"/>
-            <w:tcMar>
-              <w:top w:w="80" w:type="dxa"/>
-              <w:left w:w="120" w:type="dxa"/>
-              <w:bottom w:w="80" w:type="dxa"/>
-              <w:right w:w="120" w:type="dxa"/>
-            </w:tcMar>
           </w:tcPr>
           <w:p>
             <w:pPr>
@@ -11274,12 +10155,6 @@
               <w:right w:val="single" w:sz="4" w:space="0" w:color="C8D0DC"/>
             </w:tcBorders>
             <w:shd w:val="clear" w:color="auto" w:fill="F2F2F2"/>
-            <w:tcMar>
-              <w:top w:w="80" w:type="dxa"/>
-              <w:left w:w="120" w:type="dxa"/>
-              <w:bottom w:w="80" w:type="dxa"/>
-              <w:right w:w="120" w:type="dxa"/>
-            </w:tcMar>
           </w:tcPr>
           <w:p>
             <w:pPr>
@@ -11303,12 +10178,6 @@
               <w:right w:val="single" w:sz="4" w:space="0" w:color="C8D0DC"/>
             </w:tcBorders>
             <w:shd w:val="clear" w:color="auto" w:fill="F2F2F2"/>
-            <w:tcMar>
-              <w:top w:w="80" w:type="dxa"/>
-              <w:left w:w="120" w:type="dxa"/>
-              <w:bottom w:w="80" w:type="dxa"/>
-              <w:right w:w="120" w:type="dxa"/>
-            </w:tcMar>
           </w:tcPr>
           <w:p>
             <w:pPr>
@@ -11334,12 +10203,6 @@
               <w:right w:val="single" w:sz="4" w:space="0" w:color="C8D0DC"/>
             </w:tcBorders>
             <w:shd w:val="clear" w:color="auto" w:fill="FFFFFF"/>
-            <w:tcMar>
-              <w:top w:w="80" w:type="dxa"/>
-              <w:left w:w="120" w:type="dxa"/>
-              <w:bottom w:w="80" w:type="dxa"/>
-              <w:right w:w="120" w:type="dxa"/>
-            </w:tcMar>
           </w:tcPr>
           <w:p>
             <w:pPr>
@@ -11363,12 +10226,6 @@
               <w:right w:val="single" w:sz="4" w:space="0" w:color="C8D0DC"/>
             </w:tcBorders>
             <w:shd w:val="clear" w:color="auto" w:fill="FFFFFF"/>
-            <w:tcMar>
-              <w:top w:w="80" w:type="dxa"/>
-              <w:left w:w="120" w:type="dxa"/>
-              <w:bottom w:w="80" w:type="dxa"/>
-              <w:right w:w="120" w:type="dxa"/>
-            </w:tcMar>
           </w:tcPr>
           <w:p>
             <w:pPr>
@@ -11392,12 +10249,6 @@
               <w:right w:val="single" w:sz="4" w:space="0" w:color="C8D0DC"/>
             </w:tcBorders>
             <w:shd w:val="clear" w:color="auto" w:fill="FFFFFF"/>
-            <w:tcMar>
-              <w:top w:w="80" w:type="dxa"/>
-              <w:left w:w="120" w:type="dxa"/>
-              <w:bottom w:w="80" w:type="dxa"/>
-              <w:right w:w="120" w:type="dxa"/>
-            </w:tcMar>
           </w:tcPr>
           <w:p>
             <w:pPr>
@@ -11432,7 +10283,7 @@
   <w:abstractNum w:abstractNumId="0" w15:restartNumberingAfterBreak="0">
     <w:nsid w:val="0000A990"/>
     <w:multiLevelType w:val="multilevel"/>
-    <w:tmpl w:val="2BF0FB86"/>
+    <w:tmpl w:val="73EA6580"/>
     <w:lvl w:ilvl="0">
       <w:numFmt w:val="bullet"/>
       <w:lvlText w:val=" "/>
@@ -11509,7 +10360,7 @@
   <w:abstractNum w:abstractNumId="1" w15:restartNumberingAfterBreak="0">
     <w:nsid w:val="0000A991"/>
     <w:multiLevelType w:val="multilevel"/>
-    <w:tmpl w:val="ACC234A6"/>
+    <w:tmpl w:val="6D944408"/>
     <w:lvl w:ilvl="0">
       <w:numFmt w:val="bullet"/>
       <w:lvlText w:val=""/>
@@ -11613,7 +10464,7 @@
   <w:abstractNum w:abstractNumId="2" w15:restartNumberingAfterBreak="0">
     <w:nsid w:val="00A99411"/>
     <w:multiLevelType w:val="multilevel"/>
-    <w:tmpl w:val="DED4E93A"/>
+    <w:tmpl w:val="99A02CA8"/>
     <w:lvl w:ilvl="0">
       <w:start w:val="1"/>
       <w:numFmt w:val="decimal"/>
@@ -11696,10 +10547,10 @@
       </w:pPr>
     </w:lvl>
   </w:abstractNum>
-  <w:num w:numId="1" w16cid:durableId="1813987627">
+  <w:num w:numId="1" w16cid:durableId="412095238">
     <w:abstractNumId w:val="0"/>
   </w:num>
-  <w:num w:numId="2" w16cid:durableId="588199443">
+  <w:num w:numId="2" w16cid:durableId="1332485566">
     <w:abstractNumId w:val="2"/>
     <w:lvlOverride w:ilvl="0">
       <w:startOverride w:val="1"/>
@@ -11729,10 +10580,10 @@
       <w:startOverride w:val="1"/>
     </w:lvlOverride>
   </w:num>
-  <w:num w:numId="3" w16cid:durableId="2081707445">
+  <w:num w:numId="3" w16cid:durableId="451824329">
     <w:abstractNumId w:val="1"/>
   </w:num>
-  <w:num w:numId="4" w16cid:durableId="1148519239">
+  <w:num w:numId="4" w16cid:durableId="1179853623">
     <w:abstractNumId w:val="2"/>
     <w:lvlOverride w:ilvl="0">
       <w:startOverride w:val="1"/>
@@ -11762,25 +10613,25 @@
       <w:startOverride w:val="1"/>
     </w:lvlOverride>
   </w:num>
-  <w:num w:numId="5" w16cid:durableId="1284726730">
+  <w:num w:numId="5" w16cid:durableId="2106613099">
     <w:abstractNumId w:val="1"/>
   </w:num>
-  <w:num w:numId="6" w16cid:durableId="829711566">
+  <w:num w:numId="6" w16cid:durableId="23412033">
     <w:abstractNumId w:val="1"/>
   </w:num>
-  <w:num w:numId="7" w16cid:durableId="1024358597">
+  <w:num w:numId="7" w16cid:durableId="105664739">
     <w:abstractNumId w:val="1"/>
   </w:num>
-  <w:num w:numId="8" w16cid:durableId="384567680">
+  <w:num w:numId="8" w16cid:durableId="17854997">
     <w:abstractNumId w:val="1"/>
   </w:num>
-  <w:num w:numId="9" w16cid:durableId="601450434">
+  <w:num w:numId="9" w16cid:durableId="215704470">
     <w:abstractNumId w:val="1"/>
   </w:num>
-  <w:num w:numId="10" w16cid:durableId="586377753">
+  <w:num w:numId="10" w16cid:durableId="2053771018">
     <w:abstractNumId w:val="1"/>
   </w:num>
-  <w:num w:numId="11" w16cid:durableId="880484148">
+  <w:num w:numId="11" w16cid:durableId="1950162986">
     <w:abstractNumId w:val="1"/>
   </w:num>
 </w:numbering>
@@ -13031,7 +11882,7 @@
     <w:next w:val="Normal"/>
     <w:autoRedefine/>
     <w:uiPriority w:val="39"/>
-    <w:rsid w:val="00284CD8"/>
+    <w:rsid w:val="00C50CEC"/>
     <w:pPr>
       <w:spacing w:after="100"/>
     </w:pPr>
@@ -13042,7 +11893,7 @@
     <w:next w:val="Normal"/>
     <w:autoRedefine/>
     <w:uiPriority w:val="39"/>
-    <w:rsid w:val="00284CD8"/>
+    <w:rsid w:val="00C50CEC"/>
     <w:pPr>
       <w:spacing w:after="100"/>
       <w:ind w:left="240"/>
@@ -13054,7 +11905,7 @@
     <w:next w:val="Normal"/>
     <w:autoRedefine/>
     <w:uiPriority w:val="39"/>
-    <w:rsid w:val="00284CD8"/>
+    <w:rsid w:val="00C50CEC"/>
     <w:pPr>
       <w:spacing w:after="100"/>
       <w:ind w:left="480"/>

</xml_diff>